<commit_message>
fix: ejecutar plan de correcciones del diagnostico (catalogo Docker, PyMySQL, reportes, prod y limpieza)
</commit_message>
<xml_diff>
--- a/anexos_trabajo_investigacion/Anexo_C3_Ficha_Tecnica_Despliegue_Cloud_Run.docx
+++ b/anexos_trabajo_investigacion/Anexo_C3_Ficha_Tecnica_Despliegue_Cloud_Run.docx
@@ -1,6 +1,6 @@
 
 <file path=word/document.xml><?xml version="1.0" encoding="utf-8"?>
-<w:document xmlns:wpc="http://schemas.microsoft.com/office/word/2010/wordprocessingCanvas" xmlns:mc="http://schemas.openxmlformats.org/markup-compatibility/2006" xmlns:o="urn:schemas-microsoft-com:office:office" xmlns:r="http://schemas.openxmlformats.org/officeDocument/2006/relationships" xmlns:m="http://schemas.openxmlformats.org/officeDocument/2006/math" xmlns:v="urn:schemas-microsoft-com:vml" xmlns:wp14="http://schemas.microsoft.com/office/word/2010/wordprocessingDrawing" xmlns:wp="http://schemas.openxmlformats.org/drawingml/2006/wordprocessingDrawing" xmlns:w10="urn:schemas-microsoft-com:office:word" xmlns:w="http://schemas.openxmlformats.org/wordprocessingml/2006/main" xmlns:w14="http://schemas.microsoft.com/office/word/2010/wordml" xmlns:w15="http://schemas.microsoft.com/office/word/2012/wordml" xmlns:w16se="http://schemas.microsoft.com/office/word/2015/wordml/symex" xmlns:w16cid="http://schemas.microsoft.com/office/word/2016/wordml/cid" xmlns:w16="http://schemas.microsoft.com/office/word/2018/wordml" xmlns:w16cex="http://schemas.microsoft.com/office/word/2018/wordml/cex" xmlns:w16sdtdh="http://schemas.microsoft.com/office/word/2020/wordml/sdtdatahash" xmlns:wne="http://schemas.microsoft.com/office/word/2006/wordml" xmlns:wpg="http://schemas.microsoft.com/office/word/2010/wordprocessingGroup" xmlns:wps="http://schemas.microsoft.com/office/word/2010/wordprocessingShape" mc:Ignorable="w14 w15 w16se w16cid w16 w16cex w16sdtdh wp14">
+<w:document xmlns:wpc="http://schemas.microsoft.com/office/word/2010/wordprocessingCanvas" xmlns:mo="http://schemas.microsoft.com/office/mac/office/2008/main" xmlns:mc="http://schemas.openxmlformats.org/markup-compatibility/2006" xmlns:mv="urn:schemas-microsoft-com:mac:vml" xmlns:o="urn:schemas-microsoft-com:office:office" xmlns:r="http://schemas.openxmlformats.org/officeDocument/2006/relationships" xmlns:m="http://schemas.openxmlformats.org/officeDocument/2006/math" xmlns:v="urn:schemas-microsoft-com:vml" xmlns:wp14="http://schemas.microsoft.com/office/word/2010/wordprocessingDrawing" xmlns:wp="http://schemas.openxmlformats.org/drawingml/2006/wordprocessingDrawing" xmlns:w10="urn:schemas-microsoft-com:office:word" xmlns:w="http://schemas.openxmlformats.org/wordprocessingml/2006/main" xmlns:w14="http://schemas.microsoft.com/office/word/2010/wordml" xmlns:wpg="http://schemas.microsoft.com/office/word/2010/wordprocessingGroup" xmlns:wpi="http://schemas.microsoft.com/office/word/2010/wordprocessingInk" xmlns:wne="http://schemas.microsoft.com/office/word/2006/wordml" xmlns:wps="http://schemas.microsoft.com/office/word/2010/wordprocessingShape" mc:Ignorable="w14 wp14">
   <w:body>
     <w:p>
       <w:pPr>
@@ -9,12 +9,9 @@
       </w:pPr>
       <w:r>
         <w:rPr>
-          <w:rFonts w:ascii="Calibri" w:hAnsi="Calibri" w:eastAsia="ＭＳ 明朝" w:cs="Calibri" w:eastAsiaTheme="minorEastAsia" w:csTheme="minorBidi"/>
           <w:b/>
-          <w:bCs/>
           <w:color w:val="0284C7"/>
           <w:sz w:val="22"/>
-          <w:szCs w:val="22"/>
         </w:rPr>
         <w:t>ANEXO C.3</w:t>
       </w:r>
@@ -25,12 +22,9 @@
       </w:pPr>
       <w:r>
         <w:rPr>
-          <w:rFonts w:ascii="Calibri" w:hAnsi="Calibri" w:eastAsia="ＭＳ 明朝" w:cs="Calibri" w:eastAsiaTheme="minorEastAsia" w:csTheme="minorBidi"/>
           <w:b/>
-          <w:bCs/>
           <w:color w:val="0A508C"/>
           <w:sz w:val="34"/>
-          <w:szCs w:val="22"/>
         </w:rPr>
         <w:t>Ficha Técnica de Despliegue en la Nube (Google Cloud Run)</w:t>
       </w:r>
@@ -41,28 +35,19 @@
       </w:pPr>
       <w:r>
         <w:rPr>
-          <w:rFonts w:ascii="Calibri" w:hAnsi="Calibri" w:eastAsia="ＭＳ 明朝" w:cs="Calibri" w:eastAsiaTheme="minorEastAsia" w:csTheme="minorBidi"/>
           <w:i/>
-          <w:iCs/>
           <w:color w:val="475569"/>
           <w:sz w:val="21"/>
-          <w:szCs w:val="22"/>
         </w:rPr>
         <w:t>Especificaciones del contenedor Docker, arquitectura serverless de contenedores, asignación de memoria volátil, variables de entorno, seguridad HTTPS y políticas de autoescalado en us-central1.</w:t>
       </w:r>
     </w:p>
     <w:tbl>
       <w:tblPr>
-        <w:tblW w:w="0" w:type="auto"/>
+        <w:tblW w:type="auto" w:w="0"/>
         <w:jc w:val="center"/>
         <w:tblLayout w:type="fixed"/>
-        <w:tblCellMar>
-          <w:top w:w="0" w:type="dxa"/>
-          <w:left w:w="108" w:type="dxa"/>
-          <w:bottom w:w="0" w:type="dxa"/>
-          <w:right w:w="108" w:type="dxa"/>
-        </w:tblCellMar>
-        <w:tblLook w:firstRow="1" w:firstColumn="1" w:noVBand="1"/>
+        <w:tblLook w:firstColumn="1" w:firstRow="1" w:lastColumn="0" w:lastRow="0" w:noHBand="0" w:noVBand="1" w:val="04A0"/>
       </w:tblPr>
       <w:tblGrid>
         <w:gridCol w:w="9972"/>
@@ -70,12 +55,12 @@
       <w:tr>
         <w:tc>
           <w:tcPr>
-            <w:tcW w:w="9972" w:type="dxa"/>
-            <w:shd w:val="clear" w:fill="0A508C"/>
+            <w:tcW w:type="dxa" w:w="9972"/>
+            <w:shd w:val="clear" w:color="auto" w:fill="0A508C"/>
             <w:tcMar>
               <w:top w:w="20" w:type="dxa"/>
+              <w:bottom w:w="20" w:type="dxa"/>
               <w:left w:w="0" w:type="dxa"/>
-              <w:bottom w:w="20" w:type="dxa"/>
               <w:right w:w="0" w:type="dxa"/>
             </w:tcMar>
           </w:tcPr>
@@ -94,16 +79,10 @@
     </w:p>
     <w:tbl>
       <w:tblPr>
-        <w:tblW w:w="0" w:type="auto"/>
+        <w:tblW w:type="auto" w:w="0"/>
         <w:jc w:val="center"/>
         <w:tblLayout w:type="fixed"/>
-        <w:tblCellMar>
-          <w:top w:w="0" w:type="dxa"/>
-          <w:left w:w="108" w:type="dxa"/>
-          <w:bottom w:w="0" w:type="dxa"/>
-          <w:right w:w="108" w:type="dxa"/>
-        </w:tblCellMar>
-        <w:tblLook w:firstRow="1" w:firstColumn="1" w:noVBand="1"/>
+        <w:tblLook w:firstColumn="1" w:firstRow="1" w:lastColumn="0" w:lastRow="0" w:noHBand="0" w:noVBand="1" w:val="04A0"/>
       </w:tblPr>
       <w:tblGrid>
         <w:gridCol w:w="9972"/>
@@ -111,12 +90,12 @@
       <w:tr>
         <w:tc>
           <w:tcPr>
-            <w:tcW w:w="9972" w:type="dxa"/>
-            <w:shd w:val="clear" w:fill="E0F2FE"/>
+            <w:tcW w:type="dxa" w:w="9972"/>
+            <w:shd w:val="clear" w:color="auto" w:fill="E0F2FE"/>
             <w:tcMar>
               <w:top w:w="120" w:type="dxa"/>
+              <w:bottom w:w="120" w:type="dxa"/>
               <w:left w:w="180" w:type="dxa"/>
-              <w:bottom w:w="120" w:type="dxa"/>
               <w:right w:w="180" w:type="dxa"/>
             </w:tcMar>
           </w:tcPr>
@@ -126,24 +105,17 @@
             </w:pPr>
             <w:r>
               <w:rPr>
-                <w:rFonts w:ascii="Calibri" w:hAnsi="Calibri" w:eastAsia="ＭＳ 明朝" w:cs="Calibri" w:eastAsiaTheme="minorEastAsia" w:csTheme="minorBidi"/>
                 <w:b/>
-                <w:bCs/>
                 <w:color w:val="0A508C"/>
                 <w:sz w:val="20"/>
-                <w:szCs w:val="22"/>
               </w:rPr>
               <w:t>📌 INFRAESTRUCTURA SERVERLESS DE ALTO RENDIMIENTO</w:t>
-            </w:r>
-            <w:r>
-              <w:br w:type="textWrapping"/>
+              <w:br/>
             </w:r>
             <w:r>
               <w:rPr>
-                <w:rFonts w:ascii="Calibri" w:hAnsi="Calibri" w:eastAsia="ＭＳ 明朝" w:cs="Calibri" w:eastAsiaTheme="minorEastAsia" w:csTheme="minorBidi"/>
                 <w:color w:val="0F172A"/>
                 <w:sz w:val="19"/>
-                <w:szCs w:val="22"/>
               </w:rPr>
               <w:t>La arquitectura backend de AulaGlobal360 opera bajo un modelo de Contenedores como Servicio (CaaS) sobre Google Cloud Run (us-central1). Permite escalar automáticamente de 0 a N instancias en respuesta al tráfico escolar matutino, garantizando costo $0 en horarios nocturnos. Los cómputos de visión se ejecutan en microcontenedores optimizados de Python 3.12-slim con dependencias nativas C++ de MediaPipe, OpenCV y aceleración multicapa de Gunicorn.</w:t>
             </w:r>
@@ -163,28 +135,19 @@
       </w:pPr>
       <w:r>
         <w:rPr>
-          <w:rFonts w:ascii="Calibri" w:hAnsi="Calibri" w:eastAsia="ＭＳ ゴシック" w:cs="Calibri" w:asciiTheme="majorHAnsi" w:hAnsiTheme="majorHAnsi" w:eastAsiaTheme="majorEastAsia" w:csTheme="majorBidi"/>
           <w:b/>
-          <w:bCs/>
           <w:color w:val="0A508C"/>
           <w:sz w:val="25"/>
-          <w:szCs w:val="28"/>
         </w:rPr>
         <w:t>1. Especificación del Contenedor Docker (Dockerfile)</w:t>
       </w:r>
     </w:p>
     <w:tbl>
       <w:tblPr>
-        <w:tblW w:w="0" w:type="auto"/>
+        <w:tblW w:type="auto" w:w="0"/>
         <w:jc w:val="center"/>
         <w:tblLayout w:type="fixed"/>
-        <w:tblCellMar>
-          <w:top w:w="0" w:type="dxa"/>
-          <w:left w:w="108" w:type="dxa"/>
-          <w:bottom w:w="0" w:type="dxa"/>
-          <w:right w:w="108" w:type="dxa"/>
-        </w:tblCellMar>
-        <w:tblLook w:firstRow="1" w:firstColumn="1" w:noVBand="1"/>
+        <w:tblLook w:firstColumn="1" w:firstRow="1" w:lastColumn="0" w:lastRow="0" w:noHBand="0" w:noVBand="1" w:val="04A0"/>
       </w:tblPr>
       <w:tblGrid>
         <w:gridCol w:w="3324"/>
@@ -194,12 +157,12 @@
       <w:tr>
         <w:tc>
           <w:tcPr>
-            <w:tcW w:w="2381" w:type="dxa"/>
-            <w:shd w:val="clear" w:fill="0A508C"/>
+            <w:tcW w:type="dxa" w:w="2381"/>
+            <w:shd w:val="clear" w:color="auto" w:fill="0A508C"/>
             <w:tcMar>
               <w:top w:w="80" w:type="dxa"/>
+              <w:bottom w:w="80" w:type="dxa"/>
               <w:left w:w="120" w:type="dxa"/>
-              <w:bottom w:w="80" w:type="dxa"/>
               <w:right w:w="120" w:type="dxa"/>
             </w:tcMar>
           </w:tcPr>
@@ -210,12 +173,9 @@
             </w:pPr>
             <w:r>
               <w:rPr>
-                <w:rFonts w:ascii="Calibri" w:hAnsi="Calibri" w:eastAsia="ＭＳ 明朝" w:cs="Calibri" w:eastAsiaTheme="minorEastAsia" w:csTheme="minorBidi"/>
                 <w:b/>
-                <w:bCs/>
                 <w:color w:val="FFFFFF"/>
                 <w:sz w:val="18"/>
-                <w:szCs w:val="22"/>
               </w:rPr>
               <w:t>PARÁMETRO DOCKER</w:t>
             </w:r>
@@ -223,12 +183,12 @@
         </w:tc>
         <w:tc>
           <w:tcPr>
-            <w:tcW w:w="2551" w:type="dxa"/>
-            <w:shd w:val="clear" w:fill="0A508C"/>
+            <w:tcW w:type="dxa" w:w="2551"/>
+            <w:shd w:val="clear" w:color="auto" w:fill="0A508C"/>
             <w:tcMar>
               <w:top w:w="80" w:type="dxa"/>
+              <w:bottom w:w="80" w:type="dxa"/>
               <w:left w:w="120" w:type="dxa"/>
-              <w:bottom w:w="80" w:type="dxa"/>
               <w:right w:w="120" w:type="dxa"/>
             </w:tcMar>
           </w:tcPr>
@@ -239,12 +199,9 @@
             </w:pPr>
             <w:r>
               <w:rPr>
-                <w:rFonts w:ascii="Calibri" w:hAnsi="Calibri" w:eastAsia="ＭＳ 明朝" w:cs="Calibri" w:eastAsiaTheme="minorEastAsia" w:csTheme="minorBidi"/>
                 <w:b/>
-                <w:bCs/>
                 <w:color w:val="FFFFFF"/>
                 <w:sz w:val="18"/>
-                <w:szCs w:val="22"/>
               </w:rPr>
               <w:t>VALOR / VERSIÓN</w:t>
             </w:r>
@@ -252,12 +209,12 @@
         </w:tc>
         <w:tc>
           <w:tcPr>
-            <w:tcW w:w="5040" w:type="dxa"/>
-            <w:shd w:val="clear" w:fill="0A508C"/>
+            <w:tcW w:type="dxa" w:w="5040"/>
+            <w:shd w:val="clear" w:color="auto" w:fill="0A508C"/>
             <w:tcMar>
               <w:top w:w="80" w:type="dxa"/>
+              <w:bottom w:w="80" w:type="dxa"/>
               <w:left w:w="120" w:type="dxa"/>
-              <w:bottom w:w="80" w:type="dxa"/>
               <w:right w:w="120" w:type="dxa"/>
             </w:tcMar>
           </w:tcPr>
@@ -268,12 +225,9 @@
             </w:pPr>
             <w:r>
               <w:rPr>
-                <w:rFonts w:ascii="Calibri" w:hAnsi="Calibri" w:eastAsia="ＭＳ 明朝" w:cs="Calibri" w:eastAsiaTheme="minorEastAsia" w:csTheme="minorBidi"/>
                 <w:b/>
-                <w:bCs/>
                 <w:color w:val="FFFFFF"/>
                 <w:sz w:val="18"/>
-                <w:szCs w:val="22"/>
               </w:rPr>
               <w:t>JUSTIFICACIÓN TÉCNICA Y OPERATIVA</w:t>
             </w:r>
@@ -283,12 +237,12 @@
       <w:tr>
         <w:tc>
           <w:tcPr>
-            <w:tcW w:w="2381" w:type="dxa"/>
-            <w:shd w:val="clear" w:fill="FFFFFF"/>
+            <w:tcW w:type="dxa" w:w="2381"/>
+            <w:shd w:val="clear" w:color="auto" w:fill="FFFFFF"/>
             <w:tcMar>
               <w:top w:w="70" w:type="dxa"/>
+              <w:bottom w:w="70" w:type="dxa"/>
               <w:left w:w="110" w:type="dxa"/>
-              <w:bottom w:w="70" w:type="dxa"/>
               <w:right w:w="110" w:type="dxa"/>
             </w:tcMar>
           </w:tcPr>
@@ -299,10 +253,8 @@
             </w:pPr>
             <w:r>
               <w:rPr>
-                <w:rFonts w:ascii="Calibri" w:hAnsi="Calibri" w:eastAsia="ＭＳ 明朝" w:cs="Calibri" w:eastAsiaTheme="minorEastAsia" w:csTheme="minorBidi"/>
                 <w:color w:val="1E293B"/>
                 <w:sz w:val="17"/>
-                <w:szCs w:val="22"/>
               </w:rPr>
               <w:t>Imagen Base</w:t>
             </w:r>
@@ -310,12 +262,12 @@
         </w:tc>
         <w:tc>
           <w:tcPr>
-            <w:tcW w:w="2551" w:type="dxa"/>
-            <w:shd w:val="clear" w:fill="FFFFFF"/>
+            <w:tcW w:type="dxa" w:w="2551"/>
+            <w:shd w:val="clear" w:color="auto" w:fill="FFFFFF"/>
             <w:tcMar>
               <w:top w:w="70" w:type="dxa"/>
+              <w:bottom w:w="70" w:type="dxa"/>
               <w:left w:w="110" w:type="dxa"/>
-              <w:bottom w:w="70" w:type="dxa"/>
               <w:right w:w="110" w:type="dxa"/>
             </w:tcMar>
           </w:tcPr>
@@ -326,10 +278,8 @@
             </w:pPr>
             <w:r>
               <w:rPr>
-                <w:rFonts w:ascii="Calibri" w:hAnsi="Calibri" w:eastAsia="ＭＳ 明朝" w:cs="Calibri" w:eastAsiaTheme="minorEastAsia" w:csTheme="minorBidi"/>
                 <w:color w:val="1E293B"/>
                 <w:sz w:val="17"/>
-                <w:szCs w:val="22"/>
               </w:rPr>
               <w:t>python:3.12-slim</w:t>
             </w:r>
@@ -337,12 +287,12 @@
         </w:tc>
         <w:tc>
           <w:tcPr>
-            <w:tcW w:w="5040" w:type="dxa"/>
-            <w:shd w:val="clear" w:fill="FFFFFF"/>
+            <w:tcW w:type="dxa" w:w="5040"/>
+            <w:shd w:val="clear" w:color="auto" w:fill="FFFFFF"/>
             <w:tcMar>
               <w:top w:w="70" w:type="dxa"/>
+              <w:bottom w:w="70" w:type="dxa"/>
               <w:left w:w="110" w:type="dxa"/>
-              <w:bottom w:w="70" w:type="dxa"/>
               <w:right w:w="110" w:type="dxa"/>
             </w:tcMar>
           </w:tcPr>
@@ -353,10 +303,8 @@
             </w:pPr>
             <w:r>
               <w:rPr>
-                <w:rFonts w:ascii="Calibri" w:hAnsi="Calibri" w:eastAsia="ＭＳ 明朝" w:cs="Calibri" w:eastAsiaTheme="minorEastAsia" w:csTheme="minorBidi"/>
                 <w:color w:val="1E293B"/>
                 <w:sz w:val="17"/>
-                <w:szCs w:val="22"/>
               </w:rPr>
               <w:t>Distribución Debian Bookworm ultra liviana (~140 MB base) sin sobrecarga de GUI.</w:t>
             </w:r>
@@ -366,12 +314,12 @@
       <w:tr>
         <w:tc>
           <w:tcPr>
-            <w:tcW w:w="2381" w:type="dxa"/>
-            <w:shd w:val="clear" w:fill="F8FAFC"/>
+            <w:tcW w:type="dxa" w:w="2381"/>
+            <w:shd w:val="clear" w:color="auto" w:fill="F8FAFC"/>
             <w:tcMar>
               <w:top w:w="70" w:type="dxa"/>
+              <w:bottom w:w="70" w:type="dxa"/>
               <w:left w:w="110" w:type="dxa"/>
-              <w:bottom w:w="70" w:type="dxa"/>
               <w:right w:w="110" w:type="dxa"/>
             </w:tcMar>
           </w:tcPr>
@@ -382,10 +330,8 @@
             </w:pPr>
             <w:r>
               <w:rPr>
-                <w:rFonts w:ascii="Calibri" w:hAnsi="Calibri" w:eastAsia="ＭＳ 明朝" w:cs="Calibri" w:eastAsiaTheme="minorEastAsia" w:csTheme="minorBidi"/>
                 <w:color w:val="1E293B"/>
                 <w:sz w:val="17"/>
-                <w:szCs w:val="22"/>
               </w:rPr>
               <w:t>Dependencias del Sistema Operativo</w:t>
             </w:r>
@@ -393,12 +339,12 @@
         </w:tc>
         <w:tc>
           <w:tcPr>
-            <w:tcW w:w="2551" w:type="dxa"/>
-            <w:shd w:val="clear" w:fill="F8FAFC"/>
+            <w:tcW w:type="dxa" w:w="2551"/>
+            <w:shd w:val="clear" w:color="auto" w:fill="F8FAFC"/>
             <w:tcMar>
               <w:top w:w="70" w:type="dxa"/>
+              <w:bottom w:w="70" w:type="dxa"/>
               <w:left w:w="110" w:type="dxa"/>
-              <w:bottom w:w="70" w:type="dxa"/>
               <w:right w:w="110" w:type="dxa"/>
             </w:tcMar>
           </w:tcPr>
@@ -409,10 +355,8 @@
             </w:pPr>
             <w:r>
               <w:rPr>
-                <w:rFonts w:ascii="Calibri" w:hAnsi="Calibri" w:eastAsia="ＭＳ 明朝" w:cs="Calibri" w:eastAsiaTheme="minorEastAsia" w:csTheme="minorBidi"/>
                 <w:color w:val="1E293B"/>
                 <w:sz w:val="17"/>
-                <w:szCs w:val="22"/>
               </w:rPr>
               <w:t>libgl1, libglib2.0-0, libegl1, libgles2, ffmpeg</w:t>
             </w:r>
@@ -420,12 +364,12 @@
         </w:tc>
         <w:tc>
           <w:tcPr>
-            <w:tcW w:w="5040" w:type="dxa"/>
-            <w:shd w:val="clear" w:fill="F8FAFC"/>
+            <w:tcW w:type="dxa" w:w="5040"/>
+            <w:shd w:val="clear" w:color="auto" w:fill="F8FAFC"/>
             <w:tcMar>
               <w:top w:w="70" w:type="dxa"/>
+              <w:bottom w:w="70" w:type="dxa"/>
               <w:left w:w="110" w:type="dxa"/>
-              <w:bottom w:w="70" w:type="dxa"/>
               <w:right w:w="110" w:type="dxa"/>
             </w:tcMar>
           </w:tcPr>
@@ -436,10 +380,8 @@
             </w:pPr>
             <w:r>
               <w:rPr>
-                <w:rFonts w:ascii="Calibri" w:hAnsi="Calibri" w:eastAsia="ＭＳ 明朝" w:cs="Calibri" w:eastAsiaTheme="minorEastAsia" w:csTheme="minorBidi"/>
                 <w:color w:val="1E293B"/>
                 <w:sz w:val="17"/>
-                <w:szCs w:val="22"/>
               </w:rPr>
               <w:t>Bibliotecas C/C++ indispensables para decodificación de códecs de video MP4/WebM y renderizado headless de OpenCV/MediaPipe.</w:t>
             </w:r>
@@ -449,12 +391,12 @@
       <w:tr>
         <w:tc>
           <w:tcPr>
-            <w:tcW w:w="2381" w:type="dxa"/>
-            <w:shd w:val="clear" w:fill="FFFFFF"/>
+            <w:tcW w:type="dxa" w:w="2381"/>
+            <w:shd w:val="clear" w:color="auto" w:fill="FFFFFF"/>
             <w:tcMar>
               <w:top w:w="70" w:type="dxa"/>
+              <w:bottom w:w="70" w:type="dxa"/>
               <w:left w:w="110" w:type="dxa"/>
-              <w:bottom w:w="70" w:type="dxa"/>
               <w:right w:w="110" w:type="dxa"/>
             </w:tcMar>
           </w:tcPr>
@@ -465,10 +407,8 @@
             </w:pPr>
             <w:r>
               <w:rPr>
-                <w:rFonts w:ascii="Calibri" w:hAnsi="Calibri" w:eastAsia="ＭＳ 明朝" w:cs="Calibri" w:eastAsiaTheme="minorEastAsia" w:csTheme="minorBidi"/>
                 <w:color w:val="1E293B"/>
                 <w:sz w:val="17"/>
-                <w:szCs w:val="22"/>
               </w:rPr>
               <w:t>Gestor de Procesos WSGI</w:t>
             </w:r>
@@ -476,12 +416,12 @@
         </w:tc>
         <w:tc>
           <w:tcPr>
-            <w:tcW w:w="2551" w:type="dxa"/>
-            <w:shd w:val="clear" w:fill="FFFFFF"/>
+            <w:tcW w:type="dxa" w:w="2551"/>
+            <w:shd w:val="clear" w:color="auto" w:fill="FFFFFF"/>
             <w:tcMar>
               <w:top w:w="70" w:type="dxa"/>
+              <w:bottom w:w="70" w:type="dxa"/>
               <w:left w:w="110" w:type="dxa"/>
-              <w:bottom w:w="70" w:type="dxa"/>
               <w:right w:w="110" w:type="dxa"/>
             </w:tcMar>
           </w:tcPr>
@@ -492,10 +432,8 @@
             </w:pPr>
             <w:r>
               <w:rPr>
-                <w:rFonts w:ascii="Calibri" w:hAnsi="Calibri" w:eastAsia="ＭＳ 明朝" w:cs="Calibri" w:eastAsiaTheme="minorEastAsia" w:csTheme="minorBidi"/>
                 <w:color w:val="1E293B"/>
                 <w:sz w:val="17"/>
-                <w:szCs w:val="22"/>
               </w:rPr>
               <w:t>Gunicorn 23.0 + Uvicorn Worker</w:t>
             </w:r>
@@ -503,12 +441,12 @@
         </w:tc>
         <w:tc>
           <w:tcPr>
-            <w:tcW w:w="5040" w:type="dxa"/>
-            <w:shd w:val="clear" w:fill="FFFFFF"/>
+            <w:tcW w:type="dxa" w:w="5040"/>
+            <w:shd w:val="clear" w:color="auto" w:fill="FFFFFF"/>
             <w:tcMar>
               <w:top w:w="70" w:type="dxa"/>
+              <w:bottom w:w="70" w:type="dxa"/>
               <w:left w:w="110" w:type="dxa"/>
-              <w:bottom w:w="70" w:type="dxa"/>
               <w:right w:w="110" w:type="dxa"/>
             </w:tcMar>
           </w:tcPr>
@@ -519,10 +457,8 @@
             </w:pPr>
             <w:r>
               <w:rPr>
-                <w:rFonts w:ascii="Calibri" w:hAnsi="Calibri" w:eastAsia="ＭＳ 明朝" w:cs="Calibri" w:eastAsiaTheme="minorEastAsia" w:csTheme="minorBidi"/>
                 <w:color w:val="1E293B"/>
                 <w:sz w:val="17"/>
-                <w:szCs w:val="22"/>
               </w:rPr>
               <w:t>Servidor WSGI para producción con 3 workers concurrentes y timeout extendido de 120 s para procesamiento intensivo de video.</w:t>
             </w:r>
@@ -532,12 +468,12 @@
       <w:tr>
         <w:tc>
           <w:tcPr>
-            <w:tcW w:w="2381" w:type="dxa"/>
-            <w:shd w:val="clear" w:fill="F8FAFC"/>
+            <w:tcW w:type="dxa" w:w="2381"/>
+            <w:shd w:val="clear" w:color="auto" w:fill="F8FAFC"/>
             <w:tcMar>
               <w:top w:w="70" w:type="dxa"/>
+              <w:bottom w:w="70" w:type="dxa"/>
               <w:left w:w="110" w:type="dxa"/>
-              <w:bottom w:w="70" w:type="dxa"/>
               <w:right w:w="110" w:type="dxa"/>
             </w:tcMar>
           </w:tcPr>
@@ -548,10 +484,8 @@
             </w:pPr>
             <w:r>
               <w:rPr>
-                <w:rFonts w:ascii="Calibri" w:hAnsi="Calibri" w:eastAsia="ＭＳ 明朝" w:cs="Calibri" w:eastAsiaTheme="minorEastAsia" w:csTheme="minorBidi"/>
                 <w:color w:val="1E293B"/>
                 <w:sz w:val="17"/>
-                <w:szCs w:val="22"/>
               </w:rPr>
               <w:t>Seguridad del Contenedor</w:t>
             </w:r>
@@ -559,12 +493,12 @@
         </w:tc>
         <w:tc>
           <w:tcPr>
-            <w:tcW w:w="2551" w:type="dxa"/>
-            <w:shd w:val="clear" w:fill="F8FAFC"/>
+            <w:tcW w:type="dxa" w:w="2551"/>
+            <w:shd w:val="clear" w:color="auto" w:fill="F8FAFC"/>
             <w:tcMar>
               <w:top w:w="70" w:type="dxa"/>
+              <w:bottom w:w="70" w:type="dxa"/>
               <w:left w:w="110" w:type="dxa"/>
-              <w:bottom w:w="70" w:type="dxa"/>
               <w:right w:w="110" w:type="dxa"/>
             </w:tcMar>
           </w:tcPr>
@@ -575,10 +509,8 @@
             </w:pPr>
             <w:r>
               <w:rPr>
-                <w:rFonts w:ascii="Calibri" w:hAnsi="Calibri" w:eastAsia="ＭＳ 明朝" w:cs="Calibri" w:eastAsiaTheme="minorEastAsia" w:csTheme="minorBidi"/>
                 <w:color w:val="1E293B"/>
                 <w:sz w:val="17"/>
-                <w:szCs w:val="22"/>
               </w:rPr>
               <w:t>Usuario no privilegiado `aula` (UID 1001)</w:t>
             </w:r>
@@ -586,12 +518,12 @@
         </w:tc>
         <w:tc>
           <w:tcPr>
-            <w:tcW w:w="5040" w:type="dxa"/>
-            <w:shd w:val="clear" w:fill="F8FAFC"/>
+            <w:tcW w:type="dxa" w:w="5040"/>
+            <w:shd w:val="clear" w:color="auto" w:fill="F8FAFC"/>
             <w:tcMar>
               <w:top w:w="70" w:type="dxa"/>
+              <w:bottom w:w="70" w:type="dxa"/>
               <w:left w:w="110" w:type="dxa"/>
-              <w:bottom w:w="70" w:type="dxa"/>
               <w:right w:w="110" w:type="dxa"/>
             </w:tcMar>
           </w:tcPr>
@@ -602,10 +534,8 @@
             </w:pPr>
             <w:r>
               <w:rPr>
-                <w:rFonts w:ascii="Calibri" w:hAnsi="Calibri" w:eastAsia="ＭＳ 明朝" w:cs="Calibri" w:eastAsiaTheme="minorEastAsia" w:csTheme="minorBidi"/>
                 <w:color w:val="1E293B"/>
                 <w:sz w:val="17"/>
-                <w:szCs w:val="22"/>
               </w:rPr>
               <w:t>No-root container execution para impedir escalamiento de privilegios en el kernel host.</w:t>
             </w:r>
@@ -615,12 +545,12 @@
       <w:tr>
         <w:tc>
           <w:tcPr>
-            <w:tcW w:w="2381" w:type="dxa"/>
-            <w:shd w:val="clear" w:fill="FFFFFF"/>
+            <w:tcW w:type="dxa" w:w="2381"/>
+            <w:shd w:val="clear" w:color="auto" w:fill="FFFFFF"/>
             <w:tcMar>
               <w:top w:w="70" w:type="dxa"/>
+              <w:bottom w:w="70" w:type="dxa"/>
               <w:left w:w="110" w:type="dxa"/>
-              <w:bottom w:w="70" w:type="dxa"/>
               <w:right w:w="110" w:type="dxa"/>
             </w:tcMar>
           </w:tcPr>
@@ -631,10 +561,8 @@
             </w:pPr>
             <w:r>
               <w:rPr>
-                <w:rFonts w:ascii="Calibri" w:hAnsi="Calibri" w:eastAsia="ＭＳ 明朝" w:cs="Calibri" w:eastAsiaTheme="minorEastAsia" w:csTheme="minorBidi"/>
                 <w:color w:val="1E293B"/>
                 <w:sz w:val="17"/>
-                <w:szCs w:val="22"/>
               </w:rPr>
               <w:t>Optimización de Capas</w:t>
             </w:r>
@@ -642,12 +570,12 @@
         </w:tc>
         <w:tc>
           <w:tcPr>
-            <w:tcW w:w="2551" w:type="dxa"/>
-            <w:shd w:val="clear" w:fill="FFFFFF"/>
+            <w:tcW w:type="dxa" w:w="2551"/>
+            <w:shd w:val="clear" w:color="auto" w:fill="FFFFFF"/>
             <w:tcMar>
               <w:top w:w="70" w:type="dxa"/>
+              <w:bottom w:w="70" w:type="dxa"/>
               <w:left w:w="110" w:type="dxa"/>
-              <w:bottom w:w="70" w:type="dxa"/>
               <w:right w:w="110" w:type="dxa"/>
             </w:tcMar>
           </w:tcPr>
@@ -658,10 +586,8 @@
             </w:pPr>
             <w:r>
               <w:rPr>
-                <w:rFonts w:ascii="Calibri" w:hAnsi="Calibri" w:eastAsia="ＭＳ 明朝" w:cs="Calibri" w:eastAsiaTheme="minorEastAsia" w:csTheme="minorBidi"/>
                 <w:color w:val="1E293B"/>
                 <w:sz w:val="17"/>
-                <w:szCs w:val="22"/>
               </w:rPr>
               <w:t>Lockfile de dependencias fijadas (`requirements/lock.txt`)</w:t>
             </w:r>
@@ -669,12 +595,12 @@
         </w:tc>
         <w:tc>
           <w:tcPr>
-            <w:tcW w:w="5040" w:type="dxa"/>
-            <w:shd w:val="clear" w:fill="FFFFFF"/>
+            <w:tcW w:type="dxa" w:w="5040"/>
+            <w:shd w:val="clear" w:color="auto" w:fill="FFFFFF"/>
             <w:tcMar>
               <w:top w:w="70" w:type="dxa"/>
+              <w:bottom w:w="70" w:type="dxa"/>
               <w:left w:w="110" w:type="dxa"/>
-              <w:bottom w:w="70" w:type="dxa"/>
               <w:right w:w="110" w:type="dxa"/>
             </w:tcMar>
           </w:tcPr>
@@ -685,10 +611,8 @@
             </w:pPr>
             <w:r>
               <w:rPr>
-                <w:rFonts w:ascii="Calibri" w:hAnsi="Calibri" w:eastAsia="ＭＳ 明朝" w:cs="Calibri" w:eastAsiaTheme="minorEastAsia" w:csTheme="minorBidi"/>
                 <w:color w:val="1E293B"/>
                 <w:sz w:val="17"/>
-                <w:szCs w:val="22"/>
               </w:rPr>
               <w:t>Garantiza determinismo absoluto: MediaPipe 1.0.1 y OpenCV 4.10 fijados para evitar variaciones cinemáticas entre compilaciones.</w:t>
             </w:r>
@@ -708,28 +632,19 @@
       </w:pPr>
       <w:r>
         <w:rPr>
-          <w:rFonts w:ascii="Calibri" w:hAnsi="Calibri" w:eastAsia="ＭＳ ゴシック" w:cs="Calibri" w:asciiTheme="majorHAnsi" w:hAnsiTheme="majorHAnsi" w:eastAsiaTheme="majorEastAsia" w:csTheme="majorBidi"/>
           <w:b/>
-          <w:bCs/>
           <w:color w:val="0A508C"/>
           <w:sz w:val="25"/>
-          <w:szCs w:val="28"/>
         </w:rPr>
         <w:t>2. Configuración del Servicio en Google Cloud Run (us-central1)</w:t>
       </w:r>
     </w:p>
     <w:tbl>
       <w:tblPr>
-        <w:tblW w:w="0" w:type="auto"/>
+        <w:tblW w:type="auto" w:w="0"/>
         <w:jc w:val="center"/>
         <w:tblLayout w:type="fixed"/>
-        <w:tblCellMar>
-          <w:top w:w="0" w:type="dxa"/>
-          <w:left w:w="108" w:type="dxa"/>
-          <w:bottom w:w="0" w:type="dxa"/>
-          <w:right w:w="108" w:type="dxa"/>
-        </w:tblCellMar>
-        <w:tblLook w:firstRow="1" w:firstColumn="1" w:noVBand="1"/>
+        <w:tblLook w:firstColumn="1" w:firstRow="1" w:lastColumn="0" w:lastRow="0" w:noHBand="0" w:noVBand="1" w:val="04A0"/>
       </w:tblPr>
       <w:tblGrid>
         <w:gridCol w:w="3324"/>
@@ -739,12 +654,12 @@
       <w:tr>
         <w:tc>
           <w:tcPr>
-            <w:tcW w:w="2551" w:type="dxa"/>
-            <w:shd w:val="clear" w:fill="0A508C"/>
+            <w:tcW w:type="dxa" w:w="2551"/>
+            <w:shd w:val="clear" w:color="auto" w:fill="0A508C"/>
             <w:tcMar>
               <w:top w:w="80" w:type="dxa"/>
+              <w:bottom w:w="80" w:type="dxa"/>
               <w:left w:w="120" w:type="dxa"/>
-              <w:bottom w:w="80" w:type="dxa"/>
               <w:right w:w="120" w:type="dxa"/>
             </w:tcMar>
           </w:tcPr>
@@ -755,12 +670,9 @@
             </w:pPr>
             <w:r>
               <w:rPr>
-                <w:rFonts w:ascii="Calibri" w:hAnsi="Calibri" w:eastAsia="ＭＳ 明朝" w:cs="Calibri" w:eastAsiaTheme="minorEastAsia" w:csTheme="minorBidi"/>
                 <w:b/>
-                <w:bCs/>
                 <w:color w:val="FFFFFF"/>
                 <w:sz w:val="18"/>
-                <w:szCs w:val="22"/>
               </w:rPr>
               <w:t>PARÁMETRO CLOUD RUN</w:t>
             </w:r>
@@ -768,12 +680,12 @@
         </w:tc>
         <w:tc>
           <w:tcPr>
-            <w:tcW w:w="2551" w:type="dxa"/>
-            <w:shd w:val="clear" w:fill="0A508C"/>
+            <w:tcW w:type="dxa" w:w="2551"/>
+            <w:shd w:val="clear" w:color="auto" w:fill="0A508C"/>
             <w:tcMar>
               <w:top w:w="80" w:type="dxa"/>
+              <w:bottom w:w="80" w:type="dxa"/>
               <w:left w:w="120" w:type="dxa"/>
-              <w:bottom w:w="80" w:type="dxa"/>
               <w:right w:w="120" w:type="dxa"/>
             </w:tcMar>
           </w:tcPr>
@@ -784,12 +696,9 @@
             </w:pPr>
             <w:r>
               <w:rPr>
-                <w:rFonts w:ascii="Calibri" w:hAnsi="Calibri" w:eastAsia="ＭＳ 明朝" w:cs="Calibri" w:eastAsiaTheme="minorEastAsia" w:csTheme="minorBidi"/>
                 <w:b/>
-                <w:bCs/>
                 <w:color w:val="FFFFFF"/>
                 <w:sz w:val="18"/>
-                <w:szCs w:val="22"/>
               </w:rPr>
               <w:t>CONFIGURACIÓN</w:t>
             </w:r>
@@ -797,12 +706,12 @@
         </w:tc>
         <w:tc>
           <w:tcPr>
-            <w:tcW w:w="4870" w:type="dxa"/>
-            <w:shd w:val="clear" w:fill="0A508C"/>
+            <w:tcW w:type="dxa" w:w="4870"/>
+            <w:shd w:val="clear" w:color="auto" w:fill="0A508C"/>
             <w:tcMar>
               <w:top w:w="80" w:type="dxa"/>
+              <w:bottom w:w="80" w:type="dxa"/>
               <w:left w:w="120" w:type="dxa"/>
-              <w:bottom w:w="80" w:type="dxa"/>
               <w:right w:w="120" w:type="dxa"/>
             </w:tcMar>
           </w:tcPr>
@@ -813,12 +722,9 @@
             </w:pPr>
             <w:r>
               <w:rPr>
-                <w:rFonts w:ascii="Calibri" w:hAnsi="Calibri" w:eastAsia="ＭＳ 明朝" w:cs="Calibri" w:eastAsiaTheme="minorEastAsia" w:csTheme="minorBidi"/>
                 <w:b/>
-                <w:bCs/>
                 <w:color w:val="FFFFFF"/>
                 <w:sz w:val="18"/>
-                <w:szCs w:val="22"/>
               </w:rPr>
               <w:t>DESCRIPCIÓN DE LA POLÍTICA</w:t>
             </w:r>
@@ -828,12 +734,12 @@
       <w:tr>
         <w:tc>
           <w:tcPr>
-            <w:tcW w:w="2551" w:type="dxa"/>
-            <w:shd w:val="clear" w:fill="FFFFFF"/>
+            <w:tcW w:type="dxa" w:w="2551"/>
+            <w:shd w:val="clear" w:color="auto" w:fill="FFFFFF"/>
             <w:tcMar>
               <w:top w:w="70" w:type="dxa"/>
+              <w:bottom w:w="70" w:type="dxa"/>
               <w:left w:w="110" w:type="dxa"/>
-              <w:bottom w:w="70" w:type="dxa"/>
               <w:right w:w="110" w:type="dxa"/>
             </w:tcMar>
           </w:tcPr>
@@ -844,10 +750,8 @@
             </w:pPr>
             <w:r>
               <w:rPr>
-                <w:rFonts w:ascii="Calibri" w:hAnsi="Calibri" w:eastAsia="ＭＳ 明朝" w:cs="Calibri" w:eastAsiaTheme="minorEastAsia" w:csTheme="minorBidi"/>
                 <w:color w:val="1E293B"/>
                 <w:sz w:val="17"/>
-                <w:szCs w:val="22"/>
               </w:rPr>
               <w:t>Región Geográfica</w:t>
             </w:r>
@@ -855,12 +759,12 @@
         </w:tc>
         <w:tc>
           <w:tcPr>
-            <w:tcW w:w="2551" w:type="dxa"/>
-            <w:shd w:val="clear" w:fill="FFFFFF"/>
+            <w:tcW w:type="dxa" w:w="2551"/>
+            <w:shd w:val="clear" w:color="auto" w:fill="FFFFFF"/>
             <w:tcMar>
               <w:top w:w="70" w:type="dxa"/>
+              <w:bottom w:w="70" w:type="dxa"/>
               <w:left w:w="110" w:type="dxa"/>
-              <w:bottom w:w="70" w:type="dxa"/>
               <w:right w:w="110" w:type="dxa"/>
             </w:tcMar>
           </w:tcPr>
@@ -871,10 +775,8 @@
             </w:pPr>
             <w:r>
               <w:rPr>
-                <w:rFonts w:ascii="Calibri" w:hAnsi="Calibri" w:eastAsia="ＭＳ 明朝" w:cs="Calibri" w:eastAsiaTheme="minorEastAsia" w:csTheme="minorBidi"/>
                 <w:color w:val="1E293B"/>
                 <w:sz w:val="17"/>
-                <w:szCs w:val="22"/>
               </w:rPr>
               <w:t>us-central1 (Iowa, USA)</w:t>
             </w:r>
@@ -882,12 +784,12 @@
         </w:tc>
         <w:tc>
           <w:tcPr>
-            <w:tcW w:w="4870" w:type="dxa"/>
-            <w:shd w:val="clear" w:fill="FFFFFF"/>
+            <w:tcW w:type="dxa" w:w="4870"/>
+            <w:shd w:val="clear" w:color="auto" w:fill="FFFFFF"/>
             <w:tcMar>
               <w:top w:w="70" w:type="dxa"/>
+              <w:bottom w:w="70" w:type="dxa"/>
               <w:left w:w="110" w:type="dxa"/>
-              <w:bottom w:w="70" w:type="dxa"/>
               <w:right w:w="110" w:type="dxa"/>
             </w:tcMar>
           </w:tcPr>
@@ -898,10 +800,8 @@
             </w:pPr>
             <w:r>
               <w:rPr>
-                <w:rFonts w:ascii="Calibri" w:hAnsi="Calibri" w:eastAsia="ＭＳ 明朝" w:cs="Calibri" w:eastAsiaTheme="minorEastAsia" w:csTheme="minorBidi"/>
                 <w:color w:val="1E293B"/>
                 <w:sz w:val="17"/>
-                <w:szCs w:val="22"/>
               </w:rPr>
               <w:t>Baja latencia con Colombia (~75 ms) y máxima disponibilidad de cuotas para modelos de Gemini.</w:t>
             </w:r>
@@ -911,12 +811,12 @@
       <w:tr>
         <w:tc>
           <w:tcPr>
-            <w:tcW w:w="2551" w:type="dxa"/>
-            <w:shd w:val="clear" w:fill="F8FAFC"/>
+            <w:tcW w:type="dxa" w:w="2551"/>
+            <w:shd w:val="clear" w:color="auto" w:fill="F8FAFC"/>
             <w:tcMar>
               <w:top w:w="70" w:type="dxa"/>
+              <w:bottom w:w="70" w:type="dxa"/>
               <w:left w:w="110" w:type="dxa"/>
-              <w:bottom w:w="70" w:type="dxa"/>
               <w:right w:w="110" w:type="dxa"/>
             </w:tcMar>
           </w:tcPr>
@@ -927,10 +827,8 @@
             </w:pPr>
             <w:r>
               <w:rPr>
-                <w:rFonts w:ascii="Calibri" w:hAnsi="Calibri" w:eastAsia="ＭＳ 明朝" w:cs="Calibri" w:eastAsiaTheme="minorEastAsia" w:csTheme="minorBidi"/>
                 <w:color w:val="1E293B"/>
                 <w:sz w:val="17"/>
-                <w:szCs w:val="22"/>
               </w:rPr>
               <w:t>Asignación de CPU</w:t>
             </w:r>
@@ -938,12 +836,12 @@
         </w:tc>
         <w:tc>
           <w:tcPr>
-            <w:tcW w:w="2551" w:type="dxa"/>
-            <w:shd w:val="clear" w:fill="F8FAFC"/>
+            <w:tcW w:type="dxa" w:w="2551"/>
+            <w:shd w:val="clear" w:color="auto" w:fill="F8FAFC"/>
             <w:tcMar>
               <w:top w:w="70" w:type="dxa"/>
+              <w:bottom w:w="70" w:type="dxa"/>
               <w:left w:w="110" w:type="dxa"/>
-              <w:bottom w:w="70" w:type="dxa"/>
               <w:right w:w="110" w:type="dxa"/>
             </w:tcMar>
           </w:tcPr>
@@ -954,10 +852,8 @@
             </w:pPr>
             <w:r>
               <w:rPr>
-                <w:rFonts w:ascii="Calibri" w:hAnsi="Calibri" w:eastAsia="ＭＳ 明朝" w:cs="Calibri" w:eastAsiaTheme="minorEastAsia" w:csTheme="minorBidi"/>
                 <w:color w:val="1E293B"/>
                 <w:sz w:val="17"/>
-                <w:szCs w:val="22"/>
               </w:rPr>
               <w:t>2 vCPU Dedicadas</w:t>
             </w:r>
@@ -965,12 +861,12 @@
         </w:tc>
         <w:tc>
           <w:tcPr>
-            <w:tcW w:w="4870" w:type="dxa"/>
-            <w:shd w:val="clear" w:fill="F8FAFC"/>
+            <w:tcW w:type="dxa" w:w="4870"/>
+            <w:shd w:val="clear" w:color="auto" w:fill="F8FAFC"/>
             <w:tcMar>
               <w:top w:w="70" w:type="dxa"/>
+              <w:bottom w:w="70" w:type="dxa"/>
               <w:left w:w="110" w:type="dxa"/>
-              <w:bottom w:w="70" w:type="dxa"/>
               <w:right w:w="110" w:type="dxa"/>
             </w:tcMar>
           </w:tcPr>
@@ -981,10 +877,8 @@
             </w:pPr>
             <w:r>
               <w:rPr>
-                <w:rFonts w:ascii="Calibri" w:hAnsi="Calibri" w:eastAsia="ＭＳ 明朝" w:cs="Calibri" w:eastAsiaTheme="minorEastAsia" w:csTheme="minorBidi"/>
                 <w:color w:val="1E293B"/>
                 <w:sz w:val="17"/>
-                <w:szCs w:val="22"/>
               </w:rPr>
               <w:t>Potencia suficiente para la decodificación de fotogramas y transformaciones espaciales en CPU.</w:t>
             </w:r>
@@ -994,12 +888,12 @@
       <w:tr>
         <w:tc>
           <w:tcPr>
-            <w:tcW w:w="2551" w:type="dxa"/>
-            <w:shd w:val="clear" w:fill="FFFFFF"/>
+            <w:tcW w:type="dxa" w:w="2551"/>
+            <w:shd w:val="clear" w:color="auto" w:fill="FFFFFF"/>
             <w:tcMar>
               <w:top w:w="70" w:type="dxa"/>
+              <w:bottom w:w="70" w:type="dxa"/>
               <w:left w:w="110" w:type="dxa"/>
-              <w:bottom w:w="70" w:type="dxa"/>
               <w:right w:w="110" w:type="dxa"/>
             </w:tcMar>
           </w:tcPr>
@@ -1010,10 +904,8 @@
             </w:pPr>
             <w:r>
               <w:rPr>
-                <w:rFonts w:ascii="Calibri" w:hAnsi="Calibri" w:eastAsia="ＭＳ 明朝" w:cs="Calibri" w:eastAsiaTheme="minorEastAsia" w:csTheme="minorBidi"/>
                 <w:color w:val="1E293B"/>
                 <w:sz w:val="17"/>
-                <w:szCs w:val="22"/>
               </w:rPr>
               <w:t>Memoria Volátil (RAM)</w:t>
             </w:r>
@@ -1021,12 +913,12 @@
         </w:tc>
         <w:tc>
           <w:tcPr>
-            <w:tcW w:w="2551" w:type="dxa"/>
-            <w:shd w:val="clear" w:fill="FFFFFF"/>
+            <w:tcW w:type="dxa" w:w="2551"/>
+            <w:shd w:val="clear" w:color="auto" w:fill="FFFFFF"/>
             <w:tcMar>
               <w:top w:w="70" w:type="dxa"/>
+              <w:bottom w:w="70" w:type="dxa"/>
               <w:left w:w="110" w:type="dxa"/>
-              <w:bottom w:w="70" w:type="dxa"/>
               <w:right w:w="110" w:type="dxa"/>
             </w:tcMar>
           </w:tcPr>
@@ -1037,10 +929,8 @@
             </w:pPr>
             <w:r>
               <w:rPr>
-                <w:rFonts w:ascii="Calibri" w:hAnsi="Calibri" w:eastAsia="ＭＳ 明朝" w:cs="Calibri" w:eastAsiaTheme="minorEastAsia" w:csTheme="minorBidi"/>
                 <w:color w:val="1E293B"/>
                 <w:sz w:val="17"/>
-                <w:szCs w:val="22"/>
               </w:rPr>
               <w:t>2048 MiB (2 GiB)</w:t>
             </w:r>
@@ -1048,12 +938,12 @@
         </w:tc>
         <w:tc>
           <w:tcPr>
-            <w:tcW w:w="4870" w:type="dxa"/>
-            <w:shd w:val="clear" w:fill="FFFFFF"/>
+            <w:tcW w:type="dxa" w:w="4870"/>
+            <w:shd w:val="clear" w:color="auto" w:fill="FFFFFF"/>
             <w:tcMar>
               <w:top w:w="70" w:type="dxa"/>
+              <w:bottom w:w="70" w:type="dxa"/>
               <w:left w:w="110" w:type="dxa"/>
-              <w:bottom w:w="70" w:type="dxa"/>
               <w:right w:w="110" w:type="dxa"/>
             </w:tcMar>
           </w:tcPr>
@@ -1064,10 +954,8 @@
             </w:pPr>
             <w:r>
               <w:rPr>
-                <w:rFonts w:ascii="Calibri" w:hAnsi="Calibri" w:eastAsia="ＭＳ 明朝" w:cs="Calibri" w:eastAsiaTheme="minorEastAsia" w:csTheme="minorBidi"/>
                 <w:color w:val="1E293B"/>
                 <w:sz w:val="17"/>
-                <w:szCs w:val="22"/>
               </w:rPr>
               <w:t>Soporta el footprint del modelo MediaPipe PoseLandmarker en RAM sin activación de swapping.</w:t>
             </w:r>
@@ -1077,12 +965,12 @@
       <w:tr>
         <w:tc>
           <w:tcPr>
-            <w:tcW w:w="2551" w:type="dxa"/>
-            <w:shd w:val="clear" w:fill="F8FAFC"/>
+            <w:tcW w:type="dxa" w:w="2551"/>
+            <w:shd w:val="clear" w:color="auto" w:fill="F8FAFC"/>
             <w:tcMar>
               <w:top w:w="70" w:type="dxa"/>
+              <w:bottom w:w="70" w:type="dxa"/>
               <w:left w:w="110" w:type="dxa"/>
-              <w:bottom w:w="70" w:type="dxa"/>
               <w:right w:w="110" w:type="dxa"/>
             </w:tcMar>
           </w:tcPr>
@@ -1093,10 +981,8 @@
             </w:pPr>
             <w:r>
               <w:rPr>
-                <w:rFonts w:ascii="Calibri" w:hAnsi="Calibri" w:eastAsia="ＭＳ 明朝" w:cs="Calibri" w:eastAsiaTheme="minorEastAsia" w:csTheme="minorBidi"/>
                 <w:color w:val="1E293B"/>
                 <w:sz w:val="17"/>
-                <w:szCs w:val="22"/>
               </w:rPr>
               <w:t>Modelo de Concurrencia</w:t>
             </w:r>
@@ -1104,12 +990,12 @@
         </w:tc>
         <w:tc>
           <w:tcPr>
-            <w:tcW w:w="2551" w:type="dxa"/>
-            <w:shd w:val="clear" w:fill="F8FAFC"/>
+            <w:tcW w:type="dxa" w:w="2551"/>
+            <w:shd w:val="clear" w:color="auto" w:fill="F8FAFC"/>
             <w:tcMar>
               <w:top w:w="70" w:type="dxa"/>
+              <w:bottom w:w="70" w:type="dxa"/>
               <w:left w:w="110" w:type="dxa"/>
-              <w:bottom w:w="70" w:type="dxa"/>
               <w:right w:w="110" w:type="dxa"/>
             </w:tcMar>
           </w:tcPr>
@@ -1120,10 +1006,8 @@
             </w:pPr>
             <w:r>
               <w:rPr>
-                <w:rFonts w:ascii="Calibri" w:hAnsi="Calibri" w:eastAsia="ＭＳ 明朝" w:cs="Calibri" w:eastAsiaTheme="minorEastAsia" w:csTheme="minorBidi"/>
                 <w:color w:val="1E293B"/>
                 <w:sz w:val="17"/>
-                <w:szCs w:val="22"/>
               </w:rPr>
               <w:t>80 solicitudes simultáneas por instancia</w:t>
             </w:r>
@@ -1131,12 +1015,12 @@
         </w:tc>
         <w:tc>
           <w:tcPr>
-            <w:tcW w:w="4870" w:type="dxa"/>
-            <w:shd w:val="clear" w:fill="F8FAFC"/>
+            <w:tcW w:type="dxa" w:w="4870"/>
+            <w:shd w:val="clear" w:color="auto" w:fill="F8FAFC"/>
             <w:tcMar>
               <w:top w:w="70" w:type="dxa"/>
+              <w:bottom w:w="70" w:type="dxa"/>
               <w:left w:w="110" w:type="dxa"/>
-              <w:bottom w:w="70" w:type="dxa"/>
               <w:right w:w="110" w:type="dxa"/>
             </w:tcMar>
           </w:tcPr>
@@ -1147,10 +1031,8 @@
             </w:pPr>
             <w:r>
               <w:rPr>
-                <w:rFonts w:ascii="Calibri" w:hAnsi="Calibri" w:eastAsia="ＭＳ 明朝" w:cs="Calibri" w:eastAsiaTheme="minorEastAsia" w:csTheme="minorBidi"/>
                 <w:color w:val="1E293B"/>
                 <w:sz w:val="17"/>
-                <w:szCs w:val="22"/>
               </w:rPr>
               <w:t>Distribución eficiente de peticiones web y reportes antes de activar un nuevo contenedor.</w:t>
             </w:r>
@@ -1160,12 +1042,12 @@
       <w:tr>
         <w:tc>
           <w:tcPr>
-            <w:tcW w:w="2551" w:type="dxa"/>
-            <w:shd w:val="clear" w:fill="FFFFFF"/>
+            <w:tcW w:type="dxa" w:w="2551"/>
+            <w:shd w:val="clear" w:color="auto" w:fill="FFFFFF"/>
             <w:tcMar>
               <w:top w:w="70" w:type="dxa"/>
+              <w:bottom w:w="70" w:type="dxa"/>
               <w:left w:w="110" w:type="dxa"/>
-              <w:bottom w:w="70" w:type="dxa"/>
               <w:right w:w="110" w:type="dxa"/>
             </w:tcMar>
           </w:tcPr>
@@ -1176,10 +1058,8 @@
             </w:pPr>
             <w:r>
               <w:rPr>
-                <w:rFonts w:ascii="Calibri" w:hAnsi="Calibri" w:eastAsia="ＭＳ 明朝" w:cs="Calibri" w:eastAsiaTheme="minorEastAsia" w:csTheme="minorBidi"/>
                 <w:color w:val="1E293B"/>
                 <w:sz w:val="17"/>
-                <w:szCs w:val="22"/>
               </w:rPr>
               <w:t>Autoescalado Dinámico</w:t>
             </w:r>
@@ -1187,12 +1067,12 @@
         </w:tc>
         <w:tc>
           <w:tcPr>
-            <w:tcW w:w="2551" w:type="dxa"/>
-            <w:shd w:val="clear" w:fill="FFFFFF"/>
+            <w:tcW w:type="dxa" w:w="2551"/>
+            <w:shd w:val="clear" w:color="auto" w:fill="FFFFFF"/>
             <w:tcMar>
               <w:top w:w="70" w:type="dxa"/>
+              <w:bottom w:w="70" w:type="dxa"/>
               <w:left w:w="110" w:type="dxa"/>
-              <w:bottom w:w="70" w:type="dxa"/>
               <w:right w:w="110" w:type="dxa"/>
             </w:tcMar>
           </w:tcPr>
@@ -1203,10 +1083,8 @@
             </w:pPr>
             <w:r>
               <w:rPr>
-                <w:rFonts w:ascii="Calibri" w:hAnsi="Calibri" w:eastAsia="ＭＳ 明朝" w:cs="Calibri" w:eastAsiaTheme="minorEastAsia" w:csTheme="minorBidi"/>
                 <w:color w:val="1E293B"/>
                 <w:sz w:val="17"/>
-                <w:szCs w:val="22"/>
               </w:rPr>
               <w:t>Mínimo: 0 instancias | Máximo: 10 instancias</w:t>
             </w:r>
@@ -1214,12 +1092,12 @@
         </w:tc>
         <w:tc>
           <w:tcPr>
-            <w:tcW w:w="4870" w:type="dxa"/>
-            <w:shd w:val="clear" w:fill="FFFFFF"/>
+            <w:tcW w:type="dxa" w:w="4870"/>
+            <w:shd w:val="clear" w:color="auto" w:fill="FFFFFF"/>
             <w:tcMar>
               <w:top w:w="70" w:type="dxa"/>
+              <w:bottom w:w="70" w:type="dxa"/>
               <w:left w:w="110" w:type="dxa"/>
-              <w:bottom w:w="70" w:type="dxa"/>
               <w:right w:w="110" w:type="dxa"/>
             </w:tcMar>
           </w:tcPr>
@@ -1230,10 +1108,8 @@
             </w:pPr>
             <w:r>
               <w:rPr>
-                <w:rFonts w:ascii="Calibri" w:hAnsi="Calibri" w:eastAsia="ＭＳ 明朝" w:cs="Calibri" w:eastAsiaTheme="minorEastAsia" w:csTheme="minorBidi"/>
                 <w:color w:val="1E293B"/>
                 <w:sz w:val="17"/>
-                <w:szCs w:val="22"/>
               </w:rPr>
               <w:t>Escalado a cero (Scale-to-zero) elimina costos ociosos fuera de la jornada académica.</w:t>
             </w:r>
@@ -1243,12 +1119,12 @@
       <w:tr>
         <w:tc>
           <w:tcPr>
-            <w:tcW w:w="2551" w:type="dxa"/>
-            <w:shd w:val="clear" w:fill="F8FAFC"/>
+            <w:tcW w:type="dxa" w:w="2551"/>
+            <w:shd w:val="clear" w:color="auto" w:fill="F8FAFC"/>
             <w:tcMar>
               <w:top w:w="70" w:type="dxa"/>
+              <w:bottom w:w="70" w:type="dxa"/>
               <w:left w:w="110" w:type="dxa"/>
-              <w:bottom w:w="70" w:type="dxa"/>
               <w:right w:w="110" w:type="dxa"/>
             </w:tcMar>
           </w:tcPr>
@@ -1259,10 +1135,8 @@
             </w:pPr>
             <w:r>
               <w:rPr>
-                <w:rFonts w:ascii="Calibri" w:hAnsi="Calibri" w:eastAsia="ＭＳ 明朝" w:cs="Calibri" w:eastAsiaTheme="minorEastAsia" w:csTheme="minorBidi"/>
                 <w:color w:val="1E293B"/>
                 <w:sz w:val="17"/>
-                <w:szCs w:val="22"/>
               </w:rPr>
               <w:t>Asignación de CPU</w:t>
             </w:r>
@@ -1270,12 +1144,12 @@
         </w:tc>
         <w:tc>
           <w:tcPr>
-            <w:tcW w:w="2551" w:type="dxa"/>
-            <w:shd w:val="clear" w:fill="F8FAFC"/>
+            <w:tcW w:type="dxa" w:w="2551"/>
+            <w:shd w:val="clear" w:color="auto" w:fill="F8FAFC"/>
             <w:tcMar>
               <w:top w:w="70" w:type="dxa"/>
+              <w:bottom w:w="70" w:type="dxa"/>
               <w:left w:w="110" w:type="dxa"/>
-              <w:bottom w:w="70" w:type="dxa"/>
               <w:right w:w="110" w:type="dxa"/>
             </w:tcMar>
           </w:tcPr>
@@ -1286,10 +1160,8 @@
             </w:pPr>
             <w:r>
               <w:rPr>
-                <w:rFonts w:ascii="Calibri" w:hAnsi="Calibri" w:eastAsia="ＭＳ 明朝" w:cs="Calibri" w:eastAsiaTheme="minorEastAsia" w:csTheme="minorBidi"/>
                 <w:color w:val="1E293B"/>
                 <w:sz w:val="17"/>
-                <w:szCs w:val="22"/>
               </w:rPr>
               <w:t>CPU asignada solo durante procesamiento de requests</w:t>
             </w:r>
@@ -1297,12 +1169,12 @@
         </w:tc>
         <w:tc>
           <w:tcPr>
-            <w:tcW w:w="4870" w:type="dxa"/>
-            <w:shd w:val="clear" w:fill="F8FAFC"/>
+            <w:tcW w:type="dxa" w:w="4870"/>
+            <w:shd w:val="clear" w:color="auto" w:fill="F8FAFC"/>
             <w:tcMar>
               <w:top w:w="70" w:type="dxa"/>
+              <w:bottom w:w="70" w:type="dxa"/>
               <w:left w:w="110" w:type="dxa"/>
-              <w:bottom w:w="70" w:type="dxa"/>
               <w:right w:w="110" w:type="dxa"/>
             </w:tcMar>
           </w:tcPr>
@@ -1313,10 +1185,8 @@
             </w:pPr>
             <w:r>
               <w:rPr>
-                <w:rFonts w:ascii="Calibri" w:hAnsi="Calibri" w:eastAsia="ＭＳ 明朝" w:cs="Calibri" w:eastAsiaTheme="minorEastAsia" w:csTheme="minorBidi"/>
                 <w:color w:val="1E293B"/>
                 <w:sz w:val="17"/>
-                <w:szCs w:val="22"/>
               </w:rPr>
               <w:t>CPU throttling automático en reposo: facturación por milisegundo exacto de cómputo.</w:t>
             </w:r>
@@ -1326,12 +1196,12 @@
       <w:tr>
         <w:tc>
           <w:tcPr>
-            <w:tcW w:w="2551" w:type="dxa"/>
-            <w:shd w:val="clear" w:fill="FFFFFF"/>
+            <w:tcW w:type="dxa" w:w="2551"/>
+            <w:shd w:val="clear" w:color="auto" w:fill="FFFFFF"/>
             <w:tcMar>
               <w:top w:w="70" w:type="dxa"/>
+              <w:bottom w:w="70" w:type="dxa"/>
               <w:left w:w="110" w:type="dxa"/>
-              <w:bottom w:w="70" w:type="dxa"/>
               <w:right w:w="110" w:type="dxa"/>
             </w:tcMar>
           </w:tcPr>
@@ -1342,10 +1212,8 @@
             </w:pPr>
             <w:r>
               <w:rPr>
-                <w:rFonts w:ascii="Calibri" w:hAnsi="Calibri" w:eastAsia="ＭＳ 明朝" w:cs="Calibri" w:eastAsiaTheme="minorEastAsia" w:csTheme="minorBidi"/>
                 <w:color w:val="1E293B"/>
                 <w:sz w:val="17"/>
-                <w:szCs w:val="22"/>
               </w:rPr>
               <w:t>Límite de Tiempo (Timeout)</w:t>
             </w:r>
@@ -1353,12 +1221,12 @@
         </w:tc>
         <w:tc>
           <w:tcPr>
-            <w:tcW w:w="2551" w:type="dxa"/>
-            <w:shd w:val="clear" w:fill="FFFFFF"/>
+            <w:tcW w:type="dxa" w:w="2551"/>
+            <w:shd w:val="clear" w:color="auto" w:fill="FFFFFF"/>
             <w:tcMar>
               <w:top w:w="70" w:type="dxa"/>
+              <w:bottom w:w="70" w:type="dxa"/>
               <w:left w:w="110" w:type="dxa"/>
-              <w:bottom w:w="70" w:type="dxa"/>
               <w:right w:w="110" w:type="dxa"/>
             </w:tcMar>
           </w:tcPr>
@@ -1369,10 +1237,8 @@
             </w:pPr>
             <w:r>
               <w:rPr>
-                <w:rFonts w:ascii="Calibri" w:hAnsi="Calibri" w:eastAsia="ＭＳ 明朝" w:cs="Calibri" w:eastAsiaTheme="minorEastAsia" w:csTheme="minorBidi"/>
                 <w:color w:val="1E293B"/>
                 <w:sz w:val="17"/>
-                <w:szCs w:val="22"/>
               </w:rPr>
               <w:t>300 segundos</w:t>
             </w:r>
@@ -1380,12 +1246,12 @@
         </w:tc>
         <w:tc>
           <w:tcPr>
-            <w:tcW w:w="4870" w:type="dxa"/>
-            <w:shd w:val="clear" w:fill="FFFFFF"/>
+            <w:tcW w:type="dxa" w:w="4870"/>
+            <w:shd w:val="clear" w:color="auto" w:fill="FFFFFF"/>
             <w:tcMar>
               <w:top w:w="70" w:type="dxa"/>
+              <w:bottom w:w="70" w:type="dxa"/>
               <w:left w:w="110" w:type="dxa"/>
-              <w:bottom w:w="70" w:type="dxa"/>
               <w:right w:w="110" w:type="dxa"/>
             </w:tcMar>
           </w:tcPr>
@@ -1396,10 +1262,8 @@
             </w:pPr>
             <w:r>
               <w:rPr>
-                <w:rFonts w:ascii="Calibri" w:hAnsi="Calibri" w:eastAsia="ＭＳ 明朝" w:cs="Calibri" w:eastAsiaTheme="minorEastAsia" w:csTheme="minorBidi"/>
                 <w:color w:val="1E293B"/>
                 <w:sz w:val="17"/>
-                <w:szCs w:val="22"/>
               </w:rPr>
               <w:t>Tolerancia ante lotes de procesamiento grupal de hasta 60 estudiantes concurrentes.</w:t>
             </w:r>
@@ -1419,28 +1283,19 @@
       </w:pPr>
       <w:r>
         <w:rPr>
-          <w:rFonts w:ascii="Calibri" w:hAnsi="Calibri" w:eastAsia="ＭＳ ゴシック" w:cs="Calibri" w:asciiTheme="majorHAnsi" w:hAnsiTheme="majorHAnsi" w:eastAsiaTheme="majorEastAsia" w:csTheme="majorBidi"/>
           <w:b/>
-          <w:bCs/>
           <w:color w:val="0A508C"/>
           <w:sz w:val="25"/>
-          <w:szCs w:val="28"/>
         </w:rPr>
         <w:t>3. Variables de Entorno y Secretos Gestionados</w:t>
       </w:r>
     </w:p>
     <w:tbl>
       <w:tblPr>
-        <w:tblW w:w="0" w:type="auto"/>
+        <w:tblW w:type="auto" w:w="0"/>
         <w:jc w:val="center"/>
         <w:tblLayout w:type="fixed"/>
-        <w:tblCellMar>
-          <w:top w:w="0" w:type="dxa"/>
-          <w:left w:w="108" w:type="dxa"/>
-          <w:bottom w:w="0" w:type="dxa"/>
-          <w:right w:w="108" w:type="dxa"/>
-        </w:tblCellMar>
-        <w:tblLook w:firstRow="1" w:firstColumn="1" w:noVBand="1"/>
+        <w:tblLook w:firstColumn="1" w:firstRow="1" w:lastColumn="0" w:lastRow="0" w:noHBand="0" w:noVBand="1" w:val="04A0"/>
       </w:tblPr>
       <w:tblGrid>
         <w:gridCol w:w="3324"/>
@@ -1450,12 +1305,12 @@
       <w:tr>
         <w:tc>
           <w:tcPr>
-            <w:tcW w:w="2551" w:type="dxa"/>
-            <w:shd w:val="clear" w:fill="0A508C"/>
+            <w:tcW w:type="dxa" w:w="2551"/>
+            <w:shd w:val="clear" w:color="auto" w:fill="0A508C"/>
             <w:tcMar>
               <w:top w:w="80" w:type="dxa"/>
+              <w:bottom w:w="80" w:type="dxa"/>
               <w:left w:w="120" w:type="dxa"/>
-              <w:bottom w:w="80" w:type="dxa"/>
               <w:right w:w="120" w:type="dxa"/>
             </w:tcMar>
           </w:tcPr>
@@ -1466,12 +1321,9 @@
             </w:pPr>
             <w:r>
               <w:rPr>
-                <w:rFonts w:ascii="Calibri" w:hAnsi="Calibri" w:eastAsia="ＭＳ 明朝" w:cs="Calibri" w:eastAsiaTheme="minorEastAsia" w:csTheme="minorBidi"/>
                 <w:b/>
-                <w:bCs/>
                 <w:color w:val="FFFFFF"/>
                 <w:sz w:val="18"/>
-                <w:szCs w:val="22"/>
               </w:rPr>
               <w:t>VARIABLE DE ENTORNO</w:t>
             </w:r>
@@ -1479,12 +1331,12 @@
         </w:tc>
         <w:tc>
           <w:tcPr>
-            <w:tcW w:w="2835" w:type="dxa"/>
-            <w:shd w:val="clear" w:fill="0A508C"/>
+            <w:tcW w:type="dxa" w:w="2835"/>
+            <w:shd w:val="clear" w:color="auto" w:fill="0A508C"/>
             <w:tcMar>
               <w:top w:w="80" w:type="dxa"/>
+              <w:bottom w:w="80" w:type="dxa"/>
               <w:left w:w="120" w:type="dxa"/>
-              <w:bottom w:w="80" w:type="dxa"/>
               <w:right w:w="120" w:type="dxa"/>
             </w:tcMar>
           </w:tcPr>
@@ -1495,12 +1347,9 @@
             </w:pPr>
             <w:r>
               <w:rPr>
-                <w:rFonts w:ascii="Calibri" w:hAnsi="Calibri" w:eastAsia="ＭＳ 明朝" w:cs="Calibri" w:eastAsiaTheme="minorEastAsia" w:csTheme="minorBidi"/>
                 <w:b/>
-                <w:bCs/>
                 <w:color w:val="FFFFFF"/>
                 <w:sz w:val="18"/>
-                <w:szCs w:val="22"/>
               </w:rPr>
               <w:t>VALOR / ORIGEN</w:t>
             </w:r>
@@ -1508,12 +1357,12 @@
         </w:tc>
         <w:tc>
           <w:tcPr>
-            <w:tcW w:w="4586" w:type="dxa"/>
-            <w:shd w:val="clear" w:fill="0A508C"/>
+            <w:tcW w:type="dxa" w:w="4586"/>
+            <w:shd w:val="clear" w:color="auto" w:fill="0A508C"/>
             <w:tcMar>
               <w:top w:w="80" w:type="dxa"/>
+              <w:bottom w:w="80" w:type="dxa"/>
               <w:left w:w="120" w:type="dxa"/>
-              <w:bottom w:w="80" w:type="dxa"/>
               <w:right w:w="120" w:type="dxa"/>
             </w:tcMar>
           </w:tcPr>
@@ -1524,12 +1373,9 @@
             </w:pPr>
             <w:r>
               <w:rPr>
-                <w:rFonts w:ascii="Calibri" w:hAnsi="Calibri" w:eastAsia="ＭＳ 明朝" w:cs="Calibri" w:eastAsiaTheme="minorEastAsia" w:csTheme="minorBidi"/>
                 <w:b/>
-                <w:bCs/>
                 <w:color w:val="FFFFFF"/>
                 <w:sz w:val="18"/>
-                <w:szCs w:val="22"/>
               </w:rPr>
               <w:t>FUNCIÓN DENTRO DEL RUNTIME</w:t>
             </w:r>
@@ -1539,12 +1385,12 @@
       <w:tr>
         <w:tc>
           <w:tcPr>
-            <w:tcW w:w="2551" w:type="dxa"/>
-            <w:shd w:val="clear" w:fill="FFFFFF"/>
+            <w:tcW w:type="dxa" w:w="2551"/>
+            <w:shd w:val="clear" w:color="auto" w:fill="FFFFFF"/>
             <w:tcMar>
               <w:top w:w="70" w:type="dxa"/>
+              <w:bottom w:w="70" w:type="dxa"/>
               <w:left w:w="110" w:type="dxa"/>
-              <w:bottom w:w="70" w:type="dxa"/>
               <w:right w:w="110" w:type="dxa"/>
             </w:tcMar>
           </w:tcPr>
@@ -1555,10 +1401,8 @@
             </w:pPr>
             <w:r>
               <w:rPr>
-                <w:rFonts w:ascii="Calibri" w:hAnsi="Calibri" w:eastAsia="ＭＳ 明朝" w:cs="Calibri" w:eastAsiaTheme="minorEastAsia" w:csTheme="minorBidi"/>
                 <w:color w:val="1E293B"/>
                 <w:sz w:val="17"/>
-                <w:szCs w:val="22"/>
               </w:rPr>
               <w:t>DJANGO_SETTINGS_MODULE</w:t>
             </w:r>
@@ -1566,12 +1410,12 @@
         </w:tc>
         <w:tc>
           <w:tcPr>
-            <w:tcW w:w="2835" w:type="dxa"/>
-            <w:shd w:val="clear" w:fill="FFFFFF"/>
+            <w:tcW w:type="dxa" w:w="2835"/>
+            <w:shd w:val="clear" w:color="auto" w:fill="FFFFFF"/>
             <w:tcMar>
               <w:top w:w="70" w:type="dxa"/>
+              <w:bottom w:w="70" w:type="dxa"/>
               <w:left w:w="110" w:type="dxa"/>
-              <w:bottom w:w="70" w:type="dxa"/>
               <w:right w:w="110" w:type="dxa"/>
             </w:tcMar>
           </w:tcPr>
@@ -1582,10 +1426,8 @@
             </w:pPr>
             <w:r>
               <w:rPr>
-                <w:rFonts w:ascii="Calibri" w:hAnsi="Calibri" w:eastAsia="ＭＳ 明朝" w:cs="Calibri" w:eastAsiaTheme="minorEastAsia" w:csTheme="minorBidi"/>
                 <w:color w:val="1E293B"/>
                 <w:sz w:val="17"/>
-                <w:szCs w:val="22"/>
               </w:rPr>
               <w:t>config.settings.prod</w:t>
             </w:r>
@@ -1593,12 +1435,12 @@
         </w:tc>
         <w:tc>
           <w:tcPr>
-            <w:tcW w:w="4586" w:type="dxa"/>
-            <w:shd w:val="clear" w:fill="FFFFFF"/>
+            <w:tcW w:type="dxa" w:w="4586"/>
+            <w:shd w:val="clear" w:color="auto" w:fill="FFFFFF"/>
             <w:tcMar>
               <w:top w:w="70" w:type="dxa"/>
+              <w:bottom w:w="70" w:type="dxa"/>
               <w:left w:w="110" w:type="dxa"/>
-              <w:bottom w:w="70" w:type="dxa"/>
               <w:right w:w="110" w:type="dxa"/>
             </w:tcMar>
           </w:tcPr>
@@ -1609,10 +1451,8 @@
             </w:pPr>
             <w:r>
               <w:rPr>
-                <w:rFonts w:ascii="Calibri" w:hAnsi="Calibri" w:eastAsia="ＭＳ 明朝" w:cs="Calibri" w:eastAsiaTheme="minorEastAsia" w:csTheme="minorBidi"/>
                 <w:color w:val="1E293B"/>
                 <w:sz w:val="17"/>
-                <w:szCs w:val="22"/>
               </w:rPr>
               <w:t>Activa compresión WhiteNoise, desactivación de DEBUG y seguridad estricta.</w:t>
             </w:r>
@@ -1622,12 +1462,12 @@
       <w:tr>
         <w:tc>
           <w:tcPr>
-            <w:tcW w:w="2551" w:type="dxa"/>
-            <w:shd w:val="clear" w:fill="F8FAFC"/>
+            <w:tcW w:type="dxa" w:w="2551"/>
+            <w:shd w:val="clear" w:color="auto" w:fill="F8FAFC"/>
             <w:tcMar>
               <w:top w:w="70" w:type="dxa"/>
+              <w:bottom w:w="70" w:type="dxa"/>
               <w:left w:w="110" w:type="dxa"/>
-              <w:bottom w:w="70" w:type="dxa"/>
               <w:right w:w="110" w:type="dxa"/>
             </w:tcMar>
           </w:tcPr>
@@ -1638,10 +1478,8 @@
             </w:pPr>
             <w:r>
               <w:rPr>
-                <w:rFonts w:ascii="Calibri" w:hAnsi="Calibri" w:eastAsia="ＭＳ 明朝" w:cs="Calibri" w:eastAsiaTheme="minorEastAsia" w:csTheme="minorBidi"/>
                 <w:color w:val="1E293B"/>
                 <w:sz w:val="17"/>
-                <w:szCs w:val="22"/>
               </w:rPr>
               <w:t>PORT</w:t>
             </w:r>
@@ -1649,12 +1487,12 @@
         </w:tc>
         <w:tc>
           <w:tcPr>
-            <w:tcW w:w="2835" w:type="dxa"/>
-            <w:shd w:val="clear" w:fill="F8FAFC"/>
+            <w:tcW w:type="dxa" w:w="2835"/>
+            <w:shd w:val="clear" w:color="auto" w:fill="F8FAFC"/>
             <w:tcMar>
               <w:top w:w="70" w:type="dxa"/>
+              <w:bottom w:w="70" w:type="dxa"/>
               <w:left w:w="110" w:type="dxa"/>
-              <w:bottom w:w="70" w:type="dxa"/>
               <w:right w:w="110" w:type="dxa"/>
             </w:tcMar>
           </w:tcPr>
@@ -1665,10 +1503,8 @@
             </w:pPr>
             <w:r>
               <w:rPr>
-                <w:rFonts w:ascii="Calibri" w:hAnsi="Calibri" w:eastAsia="ＭＳ 明朝" w:cs="Calibri" w:eastAsiaTheme="minorEastAsia" w:csTheme="minorBidi"/>
                 <w:color w:val="1E293B"/>
                 <w:sz w:val="17"/>
-                <w:szCs w:val="22"/>
               </w:rPr>
               <w:t>8000 (Inyectado por Cloud Run)</w:t>
             </w:r>
@@ -1676,12 +1512,12 @@
         </w:tc>
         <w:tc>
           <w:tcPr>
-            <w:tcW w:w="4586" w:type="dxa"/>
-            <w:shd w:val="clear" w:fill="F8FAFC"/>
+            <w:tcW w:type="dxa" w:w="4586"/>
+            <w:shd w:val="clear" w:color="auto" w:fill="F8FAFC"/>
             <w:tcMar>
               <w:top w:w="70" w:type="dxa"/>
+              <w:bottom w:w="70" w:type="dxa"/>
               <w:left w:w="110" w:type="dxa"/>
-              <w:bottom w:w="70" w:type="dxa"/>
               <w:right w:w="110" w:type="dxa"/>
             </w:tcMar>
           </w:tcPr>
@@ -1692,10 +1528,8 @@
             </w:pPr>
             <w:r>
               <w:rPr>
-                <w:rFonts w:ascii="Calibri" w:hAnsi="Calibri" w:eastAsia="ＭＳ 明朝" w:cs="Calibri" w:eastAsiaTheme="minorEastAsia" w:csTheme="minorBidi"/>
                 <w:color w:val="1E293B"/>
                 <w:sz w:val="17"/>
-                <w:szCs w:val="22"/>
               </w:rPr>
               <w:t>Enrutamiento del contenedor al puerto expuesto por el proxy de Google Cloud.</w:t>
             </w:r>
@@ -1705,12 +1539,12 @@
       <w:tr>
         <w:tc>
           <w:tcPr>
-            <w:tcW w:w="2551" w:type="dxa"/>
-            <w:shd w:val="clear" w:fill="FFFFFF"/>
+            <w:tcW w:type="dxa" w:w="2551"/>
+            <w:shd w:val="clear" w:color="auto" w:fill="FFFFFF"/>
             <w:tcMar>
               <w:top w:w="70" w:type="dxa"/>
+              <w:bottom w:w="70" w:type="dxa"/>
               <w:left w:w="110" w:type="dxa"/>
-              <w:bottom w:w="70" w:type="dxa"/>
               <w:right w:w="110" w:type="dxa"/>
             </w:tcMar>
           </w:tcPr>
@@ -1721,10 +1555,8 @@
             </w:pPr>
             <w:r>
               <w:rPr>
-                <w:rFonts w:ascii="Calibri" w:hAnsi="Calibri" w:eastAsia="ＭＳ 明朝" w:cs="Calibri" w:eastAsiaTheme="minorEastAsia" w:csTheme="minorBidi"/>
                 <w:color w:val="1E293B"/>
                 <w:sz w:val="17"/>
-                <w:szCs w:val="22"/>
               </w:rPr>
               <w:t>AULA360_POSE_GPU</w:t>
             </w:r>
@@ -1732,12 +1564,12 @@
         </w:tc>
         <w:tc>
           <w:tcPr>
-            <w:tcW w:w="2835" w:type="dxa"/>
-            <w:shd w:val="clear" w:fill="FFFFFF"/>
+            <w:tcW w:type="dxa" w:w="2835"/>
+            <w:shd w:val="clear" w:color="auto" w:fill="FFFFFF"/>
             <w:tcMar>
               <w:top w:w="70" w:type="dxa"/>
+              <w:bottom w:w="70" w:type="dxa"/>
               <w:left w:w="110" w:type="dxa"/>
-              <w:bottom w:w="70" w:type="dxa"/>
               <w:right w:w="110" w:type="dxa"/>
             </w:tcMar>
           </w:tcPr>
@@ -1748,10 +1580,8 @@
             </w:pPr>
             <w:r>
               <w:rPr>
-                <w:rFonts w:ascii="Calibri" w:hAnsi="Calibri" w:eastAsia="ＭＳ 明朝" w:cs="Calibri" w:eastAsiaTheme="minorEastAsia" w:csTheme="minorBidi"/>
                 <w:color w:val="1E293B"/>
                 <w:sz w:val="17"/>
-                <w:szCs w:val="22"/>
               </w:rPr>
               <w:t>false</w:t>
             </w:r>
@@ -1759,12 +1589,12 @@
         </w:tc>
         <w:tc>
           <w:tcPr>
-            <w:tcW w:w="4586" w:type="dxa"/>
-            <w:shd w:val="clear" w:fill="FFFFFF"/>
+            <w:tcW w:type="dxa" w:w="4586"/>
+            <w:shd w:val="clear" w:color="auto" w:fill="FFFFFF"/>
             <w:tcMar>
               <w:top w:w="70" w:type="dxa"/>
+              <w:bottom w:w="70" w:type="dxa"/>
               <w:left w:w="110" w:type="dxa"/>
-              <w:bottom w:w="70" w:type="dxa"/>
               <w:right w:w="110" w:type="dxa"/>
             </w:tcMar>
           </w:tcPr>
@@ -1775,10 +1605,8 @@
             </w:pPr>
             <w:r>
               <w:rPr>
-                <w:rFonts w:ascii="Calibri" w:hAnsi="Calibri" w:eastAsia="ＭＳ 明朝" w:cs="Calibri" w:eastAsiaTheme="minorEastAsia" w:csTheme="minorBidi"/>
                 <w:color w:val="1E293B"/>
                 <w:sz w:val="17"/>
-                <w:szCs w:val="22"/>
               </w:rPr>
               <w:t>Deshabilita búsqueda de CUDA para evitar errores de enlace en entornos sin GPU física.</w:t>
             </w:r>
@@ -1788,12 +1616,12 @@
       <w:tr>
         <w:tc>
           <w:tcPr>
-            <w:tcW w:w="2551" w:type="dxa"/>
-            <w:shd w:val="clear" w:fill="F8FAFC"/>
+            <w:tcW w:type="dxa" w:w="2551"/>
+            <w:shd w:val="clear" w:color="auto" w:fill="F8FAFC"/>
             <w:tcMar>
               <w:top w:w="70" w:type="dxa"/>
+              <w:bottom w:w="70" w:type="dxa"/>
               <w:left w:w="110" w:type="dxa"/>
-              <w:bottom w:w="70" w:type="dxa"/>
               <w:right w:w="110" w:type="dxa"/>
             </w:tcMar>
           </w:tcPr>
@@ -1804,10 +1632,8 @@
             </w:pPr>
             <w:r>
               <w:rPr>
-                <w:rFonts w:ascii="Calibri" w:hAnsi="Calibri" w:eastAsia="ＭＳ 明朝" w:cs="Calibri" w:eastAsiaTheme="minorEastAsia" w:csTheme="minorBidi"/>
                 <w:color w:val="1E293B"/>
                 <w:sz w:val="17"/>
-                <w:szCs w:val="22"/>
               </w:rPr>
               <w:t>GEMINI_API_KEY</w:t>
             </w:r>
@@ -1815,12 +1641,12 @@
         </w:tc>
         <w:tc>
           <w:tcPr>
-            <w:tcW w:w="2835" w:type="dxa"/>
-            <w:shd w:val="clear" w:fill="F8FAFC"/>
+            <w:tcW w:type="dxa" w:w="2835"/>
+            <w:shd w:val="clear" w:color="auto" w:fill="F8FAFC"/>
             <w:tcMar>
               <w:top w:w="70" w:type="dxa"/>
+              <w:bottom w:w="70" w:type="dxa"/>
               <w:left w:w="110" w:type="dxa"/>
-              <w:bottom w:w="70" w:type="dxa"/>
               <w:right w:w="110" w:type="dxa"/>
             </w:tcMar>
           </w:tcPr>
@@ -1831,10 +1657,8 @@
             </w:pPr>
             <w:r>
               <w:rPr>
-                <w:rFonts w:ascii="Calibri" w:hAnsi="Calibri" w:eastAsia="ＭＳ 明朝" w:cs="Calibri" w:eastAsiaTheme="minorEastAsia" w:csTheme="minorBidi"/>
                 <w:color w:val="1E293B"/>
                 <w:sz w:val="17"/>
-                <w:szCs w:val="22"/>
               </w:rPr>
               <w:t>Secret Manager: `gemini-api-key:latest`</w:t>
             </w:r>
@@ -1842,12 +1666,12 @@
         </w:tc>
         <w:tc>
           <w:tcPr>
-            <w:tcW w:w="4586" w:type="dxa"/>
-            <w:shd w:val="clear" w:fill="F8FAFC"/>
+            <w:tcW w:type="dxa" w:w="4586"/>
+            <w:shd w:val="clear" w:color="auto" w:fill="F8FAFC"/>
             <w:tcMar>
               <w:top w:w="70" w:type="dxa"/>
+              <w:bottom w:w="70" w:type="dxa"/>
               <w:left w:w="110" w:type="dxa"/>
-              <w:bottom w:w="70" w:type="dxa"/>
               <w:right w:w="110" w:type="dxa"/>
             </w:tcMar>
           </w:tcPr>
@@ -1858,10 +1682,8 @@
             </w:pPr>
             <w:r>
               <w:rPr>
-                <w:rFonts w:ascii="Calibri" w:hAnsi="Calibri" w:eastAsia="ＭＳ 明朝" w:cs="Calibri" w:eastAsiaTheme="minorEastAsia" w:csTheme="minorBidi"/>
                 <w:color w:val="1E293B"/>
                 <w:sz w:val="17"/>
-                <w:szCs w:val="22"/>
               </w:rPr>
               <w:t>Clave criptográfica para invocar los modelos multimodales de Google AI Studio.</w:t>
             </w:r>
@@ -1871,12 +1693,12 @@
       <w:tr>
         <w:tc>
           <w:tcPr>
-            <w:tcW w:w="2551" w:type="dxa"/>
-            <w:shd w:val="clear" w:fill="FFFFFF"/>
+            <w:tcW w:type="dxa" w:w="2551"/>
+            <w:shd w:val="clear" w:color="auto" w:fill="FFFFFF"/>
             <w:tcMar>
               <w:top w:w="70" w:type="dxa"/>
+              <w:bottom w:w="70" w:type="dxa"/>
               <w:left w:w="110" w:type="dxa"/>
-              <w:bottom w:w="70" w:type="dxa"/>
               <w:right w:w="110" w:type="dxa"/>
             </w:tcMar>
           </w:tcPr>
@@ -1887,10 +1709,8 @@
             </w:pPr>
             <w:r>
               <w:rPr>
-                <w:rFonts w:ascii="Calibri" w:hAnsi="Calibri" w:eastAsia="ＭＳ 明朝" w:cs="Calibri" w:eastAsiaTheme="minorEastAsia" w:csTheme="minorBidi"/>
                 <w:color w:val="1E293B"/>
                 <w:sz w:val="17"/>
-                <w:szCs w:val="22"/>
               </w:rPr>
               <w:t>DJANGO_SECRET_KEY</w:t>
             </w:r>
@@ -1898,12 +1718,12 @@
         </w:tc>
         <w:tc>
           <w:tcPr>
-            <w:tcW w:w="2835" w:type="dxa"/>
-            <w:shd w:val="clear" w:fill="FFFFFF"/>
+            <w:tcW w:type="dxa" w:w="2835"/>
+            <w:shd w:val="clear" w:color="auto" w:fill="FFFFFF"/>
             <w:tcMar>
               <w:top w:w="70" w:type="dxa"/>
+              <w:bottom w:w="70" w:type="dxa"/>
               <w:left w:w="110" w:type="dxa"/>
-              <w:bottom w:w="70" w:type="dxa"/>
               <w:right w:w="110" w:type="dxa"/>
             </w:tcMar>
           </w:tcPr>
@@ -1914,10 +1734,8 @@
             </w:pPr>
             <w:r>
               <w:rPr>
-                <w:rFonts w:ascii="Calibri" w:hAnsi="Calibri" w:eastAsia="ＭＳ 明朝" w:cs="Calibri" w:eastAsiaTheme="minorEastAsia" w:csTheme="minorBidi"/>
                 <w:color w:val="1E293B"/>
                 <w:sz w:val="17"/>
-                <w:szCs w:val="22"/>
               </w:rPr>
               <w:t>Secret Manager: `django-secret:latest`</w:t>
             </w:r>
@@ -1925,12 +1743,12 @@
         </w:tc>
         <w:tc>
           <w:tcPr>
-            <w:tcW w:w="4586" w:type="dxa"/>
-            <w:shd w:val="clear" w:fill="FFFFFF"/>
+            <w:tcW w:type="dxa" w:w="4586"/>
+            <w:shd w:val="clear" w:color="auto" w:fill="FFFFFF"/>
             <w:tcMar>
               <w:top w:w="70" w:type="dxa"/>
+              <w:bottom w:w="70" w:type="dxa"/>
               <w:left w:w="110" w:type="dxa"/>
-              <w:bottom w:w="70" w:type="dxa"/>
               <w:right w:w="110" w:type="dxa"/>
             </w:tcMar>
           </w:tcPr>
@@ -1941,10 +1759,8 @@
             </w:pPr>
             <w:r>
               <w:rPr>
-                <w:rFonts w:ascii="Calibri" w:hAnsi="Calibri" w:eastAsia="ＭＳ 明朝" w:cs="Calibri" w:eastAsiaTheme="minorEastAsia" w:csTheme="minorBidi"/>
                 <w:color w:val="1E293B"/>
                 <w:sz w:val="17"/>
-                <w:szCs w:val="22"/>
               </w:rPr>
               <w:t>Semilla criptográfica para firma de cookies de sesión y tokens CSRF.</w:t>
             </w:r>
@@ -1954,12 +1770,12 @@
       <w:tr>
         <w:tc>
           <w:tcPr>
-            <w:tcW w:w="2551" w:type="dxa"/>
-            <w:shd w:val="clear" w:fill="F8FAFC"/>
+            <w:tcW w:type="dxa" w:w="2551"/>
+            <w:shd w:val="clear" w:color="auto" w:fill="F8FAFC"/>
             <w:tcMar>
               <w:top w:w="70" w:type="dxa"/>
+              <w:bottom w:w="70" w:type="dxa"/>
               <w:left w:w="110" w:type="dxa"/>
-              <w:bottom w:w="70" w:type="dxa"/>
               <w:right w:w="110" w:type="dxa"/>
             </w:tcMar>
           </w:tcPr>
@@ -1970,23 +1786,21 @@
             </w:pPr>
             <w:r>
               <w:rPr>
-                <w:rFonts w:ascii="Calibri" w:hAnsi="Calibri" w:eastAsia="ＭＳ 明朝" w:cs="Calibri" w:eastAsiaTheme="minorEastAsia" w:csTheme="minorBidi"/>
                 <w:color w:val="1E293B"/>
                 <w:sz w:val="17"/>
-                <w:szCs w:val="22"/>
               </w:rPr>
-              <w:t>CSRF_TRUSTED_ORIGINS</w:t>
+              <w:t>DJANGO_CSRF_TRUSTED_ORIGINS</w:t>
             </w:r>
           </w:p>
         </w:tc>
         <w:tc>
           <w:tcPr>
-            <w:tcW w:w="2835" w:type="dxa"/>
-            <w:shd w:val="clear" w:fill="F8FAFC"/>
+            <w:tcW w:type="dxa" w:w="2835"/>
+            <w:shd w:val="clear" w:color="auto" w:fill="F8FAFC"/>
             <w:tcMar>
               <w:top w:w="70" w:type="dxa"/>
+              <w:bottom w:w="70" w:type="dxa"/>
               <w:left w:w="110" w:type="dxa"/>
-              <w:bottom w:w="70" w:type="dxa"/>
               <w:right w:w="110" w:type="dxa"/>
             </w:tcMar>
           </w:tcPr>
@@ -1997,10 +1811,8 @@
             </w:pPr>
             <w:r>
               <w:rPr>
-                <w:rFonts w:ascii="Calibri" w:hAnsi="Calibri" w:eastAsia="ＭＳ 明朝" w:cs="Calibri" w:eastAsiaTheme="minorEastAsia" w:csTheme="minorBidi"/>
                 <w:color w:val="1E293B"/>
                 <w:sz w:val="17"/>
-                <w:szCs w:val="22"/>
               </w:rPr>
               <w:t>https://*.run.app, https://aulaglobal360.com</w:t>
             </w:r>
@@ -2008,12 +1820,12 @@
         </w:tc>
         <w:tc>
           <w:tcPr>
-            <w:tcW w:w="4586" w:type="dxa"/>
-            <w:shd w:val="clear" w:fill="F8FAFC"/>
+            <w:tcW w:type="dxa" w:w="4586"/>
+            <w:shd w:val="clear" w:color="auto" w:fill="F8FAFC"/>
             <w:tcMar>
               <w:top w:w="70" w:type="dxa"/>
+              <w:bottom w:w="70" w:type="dxa"/>
               <w:left w:w="110" w:type="dxa"/>
-              <w:bottom w:w="70" w:type="dxa"/>
               <w:right w:w="110" w:type="dxa"/>
             </w:tcMar>
           </w:tcPr>
@@ -2024,10 +1836,8 @@
             </w:pPr>
             <w:r>
               <w:rPr>
-                <w:rFonts w:ascii="Calibri" w:hAnsi="Calibri" w:eastAsia="ＭＳ 明朝" w:cs="Calibri" w:eastAsiaTheme="minorEastAsia" w:csTheme="minorBidi"/>
                 <w:color w:val="1E293B"/>
                 <w:sz w:val="17"/>
-                <w:szCs w:val="22"/>
               </w:rPr>
               <w:t>Evita ataques Cross-Site Request Forgery en peticiones POST de formularios y subida de videos.</w:t>
             </w:r>
@@ -2047,63 +1857,21 @@
       </w:pPr>
       <w:r>
         <w:rPr>
-          <w:rFonts w:ascii="Calibri" w:hAnsi="Calibri" w:eastAsia="ＭＳ ゴシック" w:cs="Calibri" w:asciiTheme="majorHAnsi" w:hAnsiTheme="majorHAnsi" w:eastAsiaTheme="majorEastAsia" w:csTheme="majorBidi"/>
           <w:b/>
-          <w:bCs/>
           <w:color w:val="0A508C"/>
           <w:sz w:val="25"/>
-          <w:szCs w:val="28"/>
         </w:rPr>
         <w:t>4. Seguridad, Certificados HTTPS y Redirección Caddy/Cloud Run</w:t>
       </w:r>
     </w:p>
     <w:p>
-      <w:pPr>
-        <w:spacing w:after="80" w:line="276" w:lineRule="auto"/>
-      </w:pPr>
       <w:r>
-        <w:rPr>
-          <w:rFonts w:ascii="Calibri" w:hAnsi="Calibri" w:eastAsia="ＭＳ 明朝" w:cs="Calibri" w:eastAsiaTheme="minorEastAsia" w:csTheme="minorBidi"/>
-          <w:color w:val="1E293B"/>
-          <w:sz w:val="20"/>
-          <w:szCs w:val="22"/>
-        </w:rPr>
         <w:t>1. Certificados SSL/TLS Gestionados: Cloud Run aprovisiona y renueva automáticamente certificados X.509 de 2048 bits avalados por Google Trust Services, garantizando navegación cifrada de extremo a extremo sin costo ni mantenimiento.</w:t>
-      </w:r>
-      <w:r>
-        <w:br w:type="textWrapping"/>
-      </w:r>
-      <w:r>
-        <w:rPr>
-          <w:rFonts w:ascii="Calibri" w:hAnsi="Calibri" w:eastAsia="ＭＳ 明朝" w:cs="Calibri" w:eastAsiaTheme="minorEastAsia" w:csTheme="minorBidi"/>
-          <w:color w:val="1E293B"/>
-          <w:sz w:val="20"/>
-          <w:szCs w:val="22"/>
-        </w:rPr>
+        <w:br/>
         <w:t>2. Terminación TLS y HTTP/2: El frontend de Google Cloud gestiona la negociación SSL en el edge y reenvía el tráfico desmultiplexado hacia el socket Gunicorn.</w:t>
-      </w:r>
-      <w:r>
-        <w:br w:type="textWrapping"/>
-      </w:r>
-      <w:r>
-        <w:rPr>
-          <w:rFonts w:ascii="Calibri" w:hAnsi="Calibri" w:eastAsia="ＭＳ 明朝" w:cs="Calibri" w:eastAsiaTheme="minorEastAsia" w:csTheme="minorBidi"/>
-          <w:color w:val="1E293B"/>
-          <w:sz w:val="20"/>
-          <w:szCs w:val="22"/>
-        </w:rPr>
+        <w:br/>
         <w:t>3. Mitigación de Amenazas: Protección nativa de Google Cloud Armor contra inundación SYN, ataques DDoS en capas 3/4 y análisis de cabeceras HTTP maliciosas.</w:t>
-      </w:r>
-      <w:r>
-        <w:br w:type="textWrapping"/>
-      </w:r>
-      <w:r>
-        <w:rPr>
-          <w:rFonts w:ascii="Calibri" w:hAnsi="Calibri" w:eastAsia="ＭＳ 明朝" w:cs="Calibri" w:eastAsiaTheme="minorEastAsia" w:csTheme="minorBidi"/>
-          <w:color w:val="1E293B"/>
-          <w:sz w:val="20"/>
-          <w:szCs w:val="22"/>
-        </w:rPr>
+        <w:br/>
         <w:t>4. Aislamiento gVisor: Cada instancia del contenedor corre en un entorno sandbox gVisor que intercepta las llamadas al sistema (syscalls), aislando la ejecución de cualquier vulnerabilidad del kernel Linux.</w:t>
       </w:r>
     </w:p>
@@ -2112,6 +1880,7 @@
       <w:footerReference w:type="default" r:id="rId10"/>
       <w:pgSz w:w="12240" w:h="15840"/>
       <w:pgMar w:top="1134" w:right="1134" w:bottom="1134" w:left="1134" w:header="720" w:footer="720" w:gutter="0"/>
+      <w:cols w:space="720"/>
       <w:docGrid w:linePitch="360"/>
     </w:sectPr>
   </w:body>
@@ -2119,7 +1888,7 @@
 </file>
 
 <file path=word/footer1.xml><?xml version="1.0" encoding="utf-8"?>
-<w:ftr xmlns:wpc="http://schemas.microsoft.com/office/word/2010/wordprocessingCanvas" xmlns:mc="http://schemas.openxmlformats.org/markup-compatibility/2006" xmlns:o="urn:schemas-microsoft-com:office:office" xmlns:r="http://schemas.openxmlformats.org/officeDocument/2006/relationships" xmlns:m="http://schemas.openxmlformats.org/officeDocument/2006/math" xmlns:v="urn:schemas-microsoft-com:vml" xmlns:wp14="http://schemas.microsoft.com/office/word/2010/wordprocessingDrawing" xmlns:wp="http://schemas.openxmlformats.org/drawingml/2006/wordprocessingDrawing" xmlns:w10="urn:schemas-microsoft-com:office:word" xmlns:w="http://schemas.openxmlformats.org/wordprocessingml/2006/main" xmlns:w14="http://schemas.microsoft.com/office/word/2010/wordml" xmlns:w15="http://schemas.microsoft.com/office/word/2012/wordml" xmlns:w16se="http://schemas.microsoft.com/office/word/2015/wordml/symex" xmlns:w16cid="http://schemas.microsoft.com/office/word/2016/wordml/cid" xmlns:w16="http://schemas.microsoft.com/office/word/2018/wordml" xmlns:w16cex="http://schemas.microsoft.com/office/word/2018/wordml/cex" xmlns:w16sdtdh="http://schemas.microsoft.com/office/word/2020/wordml/sdtdatahash" xmlns:wne="http://schemas.microsoft.com/office/word/2006/wordml" xmlns:wpg="http://schemas.microsoft.com/office/word/2010/wordprocessingGroup" xmlns:wps="http://schemas.microsoft.com/office/word/2010/wordprocessingShape">
+<w:ftr xmlns:m="http://schemas.openxmlformats.org/officeDocument/2006/math" xmlns:mc="http://schemas.openxmlformats.org/markup-compatibility/2006" xmlns:mo="http://schemas.microsoft.com/office/mac/office/2008/main" xmlns:mv="urn:schemas-microsoft-com:mac:vml" xmlns:o="urn:schemas-microsoft-com:office:office" xmlns:r="http://schemas.openxmlformats.org/officeDocument/2006/relationships" xmlns:v="urn:schemas-microsoft-com:vml" xmlns:w10="urn:schemas-microsoft-com:office:word" xmlns:w14="http://schemas.microsoft.com/office/word/2010/wordml" xmlns:w="http://schemas.openxmlformats.org/wordprocessingml/2006/main" xmlns:wne="http://schemas.microsoft.com/office/word/2006/wordml" xmlns:wp14="http://schemas.microsoft.com/office/word/2010/wordprocessingDrawing" xmlns:wp="http://schemas.openxmlformats.org/drawingml/2006/wordprocessingDrawing" xmlns:wpc="http://schemas.microsoft.com/office/word/2010/wordprocessingCanvas" xmlns:wpg="http://schemas.microsoft.com/office/word/2010/wordprocessingGroup" xmlns:wpi="http://schemas.microsoft.com/office/word/2010/wordprocessingInk" xmlns:wps="http://schemas.microsoft.com/office/word/2010/wordprocessingShape" mc:Ignorable="w14 wp14">
   <w:p>
     <w:pPr>
       <w:pStyle w:val="Footer"/>
@@ -2137,7 +1906,7 @@
 </file>
 
 <file path=word/header1.xml><?xml version="1.0" encoding="utf-8"?>
-<w:hdr xmlns:wpc="http://schemas.microsoft.com/office/word/2010/wordprocessingCanvas" xmlns:mc="http://schemas.openxmlformats.org/markup-compatibility/2006" xmlns:o="urn:schemas-microsoft-com:office:office" xmlns:r="http://schemas.openxmlformats.org/officeDocument/2006/relationships" xmlns:m="http://schemas.openxmlformats.org/officeDocument/2006/math" xmlns:v="urn:schemas-microsoft-com:vml" xmlns:wp14="http://schemas.microsoft.com/office/word/2010/wordprocessingDrawing" xmlns:wp="http://schemas.openxmlformats.org/drawingml/2006/wordprocessingDrawing" xmlns:w10="urn:schemas-microsoft-com:office:word" xmlns:w="http://schemas.openxmlformats.org/wordprocessingml/2006/main" xmlns:w14="http://schemas.microsoft.com/office/word/2010/wordml" xmlns:w15="http://schemas.microsoft.com/office/word/2012/wordml" xmlns:w16se="http://schemas.microsoft.com/office/word/2015/wordml/symex" xmlns:w16cid="http://schemas.microsoft.com/office/word/2016/wordml/cid" xmlns:w16="http://schemas.microsoft.com/office/word/2018/wordml" xmlns:w16cex="http://schemas.microsoft.com/office/word/2018/wordml/cex" xmlns:w16sdtdh="http://schemas.microsoft.com/office/word/2020/wordml/sdtdatahash" xmlns:wne="http://schemas.microsoft.com/office/word/2006/wordml" xmlns:wpg="http://schemas.microsoft.com/office/word/2010/wordprocessingGroup" xmlns:wps="http://schemas.microsoft.com/office/word/2010/wordprocessingShape">
+<w:hdr xmlns:m="http://schemas.openxmlformats.org/officeDocument/2006/math" xmlns:mc="http://schemas.openxmlformats.org/markup-compatibility/2006" xmlns:mo="http://schemas.microsoft.com/office/mac/office/2008/main" xmlns:mv="urn:schemas-microsoft-com:mac:vml" xmlns:o="urn:schemas-microsoft-com:office:office" xmlns:r="http://schemas.openxmlformats.org/officeDocument/2006/relationships" xmlns:v="urn:schemas-microsoft-com:vml" xmlns:w10="urn:schemas-microsoft-com:office:word" xmlns:w14="http://schemas.microsoft.com/office/word/2010/wordml" xmlns:w="http://schemas.openxmlformats.org/wordprocessingml/2006/main" xmlns:wne="http://schemas.microsoft.com/office/word/2006/wordml" xmlns:wp14="http://schemas.microsoft.com/office/word/2010/wordprocessingDrawing" xmlns:wp="http://schemas.openxmlformats.org/drawingml/2006/wordprocessingDrawing" xmlns:wpc="http://schemas.microsoft.com/office/word/2010/wordprocessingCanvas" xmlns:wpg="http://schemas.microsoft.com/office/word/2010/wordprocessingGroup" xmlns:wpi="http://schemas.microsoft.com/office/word/2010/wordprocessingInk" xmlns:wps="http://schemas.microsoft.com/office/word/2010/wordprocessingShape" mc:Ignorable="w14 wp14">
   <w:p>
     <w:pPr>
       <w:pStyle w:val="Header"/>

</xml_diff>